<commit_message>
Reorder into one file: maps, guardrails, rubrics
Single document with a contents page and three parts, each its own area.

Part One is the two maps, so the system is seen before it is described.
Part Two is the guardrails - the universal contract, execution order,
output contract and the ten system guardrails with what each holds.
Part Three is the thirteen rubrics.

Verified structurally rather than visually: LibreOffice in this
container cannot load any docx, including the one Sam supplied, so PDF
rendering was not available. The archive itself checks out - correct
parts, both images embedded, five tables, three page breaks, headings
and numbering intact.

Co-Authored-By: Claude Opus 5 <noreply@anthropic.com>
Claude-Session: https://claude.ai/code/session_01CV3yfiTKLESTajPt6khfV9
</commit_message>
<xml_diff>
--- a/Command_Desk_Rubrics_and_Guardrails.docx
+++ b/Command_Desk_Rubrics_and_Guardrails.docx
@@ -83,7 +83,809 @@
           <w:sz w:val="32"/>
           <w:szCs w:val="32"/>
         </w:rPr>
-        <w:t xml:space="preserve">Part One — The Guardrails</w:t>
+        <w:t xml:space="preserve">Contents</w:t>
+      </w:r>
+    </w:p>
+    <w:tbl>
+      <w:tblPr>
+        <w:tblW w:type="dxa" w:w="9000"/>
+        <w:tblBorders>
+          <w:top w:val="single" w:color="C8CDD4" w:sz="4"/>
+          <w:left w:val="none"/>
+          <w:bottom w:val="single" w:color="C8CDD4" w:sz="4"/>
+          <w:right w:val="none"/>
+          <w:insideH w:val="single" w:color="DCE0E6" w:sz="2"/>
+          <w:insideV w:val="none"/>
+        </w:tblBorders>
+      </w:tblPr>
+      <w:tblGrid>
+        <w:gridCol w:w="2400"/>
+        <w:gridCol w:w="6600"/>
+      </w:tblGrid>
+      <w:tr>
+        <w:trPr>
+          <w:tblHeader/>
+        </w:trPr>
+        <w:tc>
+          <w:tcPr>
+            <w:tcW w:type="dxa" w:w="2400"/>
+            <w:shd w:fill="EDEFF2" w:color="auto" w:val="clear"/>
+            <w:tcMar>
+              <w:top w:type="dxa" w:w="90"/>
+              <w:left w:type="dxa" w:w="120"/>
+              <w:bottom w:type="dxa" w:w="90"/>
+              <w:right w:type="dxa" w:w="120"/>
+            </w:tcMar>
+          </w:tcPr>
+          <w:p>
+            <w:pPr>
+              <w:spacing w:after="0"/>
+            </w:pPr>
+            <w:r>
+              <w:rPr>
+                <w:b/>
+                <w:bCs/>
+                <w:color w:val="5C6670"/>
+                <w:sz w:val="17"/>
+                <w:szCs w:val="17"/>
+              </w:rPr>
+              <w:t xml:space="preserve">Part</w:t>
+            </w:r>
+          </w:p>
+        </w:tc>
+        <w:tc>
+          <w:tcPr>
+            <w:tcW w:type="dxa" w:w="6600"/>
+            <w:shd w:fill="EDEFF2" w:color="auto" w:val="clear"/>
+            <w:tcMar>
+              <w:top w:type="dxa" w:w="90"/>
+              <w:left w:type="dxa" w:w="120"/>
+              <w:bottom w:type="dxa" w:w="90"/>
+              <w:right w:type="dxa" w:w="120"/>
+            </w:tcMar>
+          </w:tcPr>
+          <w:p>
+            <w:pPr>
+              <w:spacing w:after="0"/>
+            </w:pPr>
+            <w:r>
+              <w:rPr>
+                <w:b/>
+                <w:bCs/>
+                <w:color w:val="5C6670"/>
+                <w:sz w:val="17"/>
+                <w:szCs w:val="17"/>
+              </w:rPr>
+              <w:t xml:space="preserve">What is in it</w:t>
+            </w:r>
+          </w:p>
+        </w:tc>
+      </w:tr>
+      <w:tr>
+        <w:tc>
+          <w:tcPr>
+            <w:tcW w:type="dxa" w:w="2400"/>
+            <w:tcMar>
+              <w:top w:type="dxa" w:w="90"/>
+              <w:left w:type="dxa" w:w="120"/>
+              <w:bottom w:type="dxa" w:w="90"/>
+              <w:right w:type="dxa" w:w="120"/>
+            </w:tcMar>
+          </w:tcPr>
+          <w:p>
+            <w:pPr>
+              <w:spacing w:after="0"/>
+            </w:pPr>
+            <w:r>
+              <w:rPr>
+                <w:color w:val="1A1D21"/>
+                <w:sz w:val="20"/>
+                <w:szCs w:val="20"/>
+              </w:rPr>
+              <w:t xml:space="preserve">One — The Map</w:t>
+            </w:r>
+          </w:p>
+        </w:tc>
+        <w:tc>
+          <w:tcPr>
+            <w:tcW w:type="dxa" w:w="6600"/>
+            <w:tcMar>
+              <w:top w:type="dxa" w:w="90"/>
+              <w:left w:type="dxa" w:w="120"/>
+              <w:bottom w:type="dxa" w:w="90"/>
+              <w:right w:type="dxa" w:w="120"/>
+            </w:tcMar>
+          </w:tcPr>
+          <w:p>
+            <w:pPr>
+              <w:spacing w:after="0"/>
+            </w:pPr>
+            <w:r>
+              <w:rPr>
+                <w:color w:val="1A1D21"/>
+                <w:sz w:val="20"/>
+                <w:szCs w:val="20"/>
+              </w:rPr>
+              <w:t xml:space="preserve">Two diagrams. How a request moves through the system, and which models can see which.</w:t>
+            </w:r>
+          </w:p>
+        </w:tc>
+      </w:tr>
+      <w:tr>
+        <w:tc>
+          <w:tcPr>
+            <w:tcW w:type="dxa" w:w="2400"/>
+            <w:tcMar>
+              <w:top w:type="dxa" w:w="90"/>
+              <w:left w:type="dxa" w:w="120"/>
+              <w:bottom w:type="dxa" w:w="90"/>
+              <w:right w:type="dxa" w:w="120"/>
+            </w:tcMar>
+          </w:tcPr>
+          <w:p>
+            <w:pPr>
+              <w:spacing w:after="0"/>
+            </w:pPr>
+            <w:r>
+              <w:rPr>
+                <w:color w:val="1A1D21"/>
+                <w:sz w:val="20"/>
+                <w:szCs w:val="20"/>
+              </w:rPr>
+              <w:t xml:space="preserve">Two — The Guardrails</w:t>
+            </w:r>
+          </w:p>
+        </w:tc>
+        <w:tc>
+          <w:tcPr>
+            <w:tcW w:type="dxa" w:w="6600"/>
+            <w:tcMar>
+              <w:top w:type="dxa" w:w="90"/>
+              <w:left w:type="dxa" w:w="120"/>
+              <w:bottom w:type="dxa" w:w="90"/>
+              <w:right w:type="dxa" w:w="120"/>
+            </w:tcMar>
+          </w:tcPr>
+          <w:p>
+            <w:pPr>
+              <w:spacing w:after="0"/>
+            </w:pPr>
+            <w:r>
+              <w:rPr>
+                <w:color w:val="1A1D21"/>
+                <w:sz w:val="20"/>
+                <w:szCs w:val="20"/>
+              </w:rPr>
+              <w:t xml:space="preserve">The universal contract every model inherits, the execution order, the output contract, and the ten system guardrails with what each one holds.</w:t>
+            </w:r>
+          </w:p>
+        </w:tc>
+      </w:tr>
+      <w:tr>
+        <w:tc>
+          <w:tcPr>
+            <w:tcW w:type="dxa" w:w="2400"/>
+            <w:tcMar>
+              <w:top w:type="dxa" w:w="90"/>
+              <w:left w:type="dxa" w:w="120"/>
+              <w:bottom w:type="dxa" w:w="90"/>
+              <w:right w:type="dxa" w:w="120"/>
+            </w:tcMar>
+          </w:tcPr>
+          <w:p>
+            <w:pPr>
+              <w:spacing w:after="0"/>
+            </w:pPr>
+            <w:r>
+              <w:rPr>
+                <w:color w:val="1A1D21"/>
+                <w:sz w:val="20"/>
+                <w:szCs w:val="20"/>
+              </w:rPr>
+              <w:t xml:space="preserve">Three — The Rubrics</w:t>
+            </w:r>
+          </w:p>
+        </w:tc>
+        <w:tc>
+          <w:tcPr>
+            <w:tcW w:type="dxa" w:w="6600"/>
+            <w:tcMar>
+              <w:top w:type="dxa" w:w="90"/>
+              <w:left w:type="dxa" w:w="120"/>
+              <w:bottom w:type="dxa" w:w="90"/>
+              <w:right w:type="dxa" w:w="120"/>
+            </w:tcMar>
+          </w:tcPr>
+          <w:p>
+            <w:pPr>
+              <w:spacing w:after="0"/>
+            </w:pPr>
+            <w:r>
+              <w:rPr>
+                <w:color w:val="1A1D21"/>
+                <w:sz w:val="20"/>
+                <w:szCs w:val="20"/>
+              </w:rPr>
+              <w:t xml:space="preserve">Thirteen models. Each with purpose, measurable requirements, verification method, auto-fail conditions, output contract, and the guards holding it.</w:t>
+            </w:r>
+          </w:p>
+        </w:tc>
+      </w:tr>
+    </w:tbl>
+    <w:p>
+      <w:pPr>
+        <w:spacing w:after="120" w:before="120"/>
+      </w:pPr>
+      <w:r>
+        <w:rPr>
+          <w:color w:val="5C6670"/>
+          <w:sz w:val="19"/>
+          <w:szCs w:val="19"/>
+        </w:rPr>
+        <w:t xml:space="preserve">Eleven models are live today. Two are new: forge, and mind, which already exists on the box with the correct prompt but is not yet in the config.</w:t>
+      </w:r>
+    </w:p>
+    <w:p>
+      <w:r>
+        <w:br w:type="page"/>
+      </w:r>
+    </w:p>
+    <w:p>
+      <w:pPr>
+        <w:pStyle w:val="Heading1"/>
+        <w:spacing w:after="160" w:before="360"/>
+      </w:pPr>
+      <w:r>
+        <w:rPr>
+          <w:b/>
+          <w:bCs/>
+          <w:color w:val="1A1D21"/>
+          <w:sz w:val="32"/>
+          <w:szCs w:val="32"/>
+        </w:rPr>
+        <w:t xml:space="preserve">Part One — The Map</w:t>
+      </w:r>
+    </w:p>
+    <w:p>
+      <w:pPr>
+        <w:spacing w:after="200" w:before="0"/>
+      </w:pPr>
+      <w:r>
+        <w:rPr>
+          <w:color w:val="5C6670"/>
+          <w:sz w:val="21"/>
+          <w:szCs w:val="21"/>
+        </w:rPr>
+        <w:t xml:space="preserve">How a request moves through the system, and who is connected to whom.</w:t>
+      </w:r>
+    </w:p>
+    <w:p>
+      <w:pPr>
+        <w:pStyle w:val="Heading2"/>
+        <w:spacing w:after="120" w:before="300"/>
+      </w:pPr>
+      <w:r>
+        <w:rPr>
+          <w:b/>
+          <w:bCs/>
+          <w:color w:val="1A1D21"/>
+          <w:sz w:val="26"/>
+          <w:szCs w:val="26"/>
+        </w:rPr>
+        <w:t xml:space="preserve">The chain</w:t>
+      </w:r>
+    </w:p>
+    <w:p>
+      <w:pPr>
+        <w:spacing w:after="140"/>
+      </w:pPr>
+      <w:r>
+        <w:drawing>
+          <wp:inline distT="0" distB="0" distL="0" distR="0">
+            <wp:extent cx="6000750" cy="6772275"/>
+            <wp:effectExtent t="0" r="0" b="0" l="0"/>
+            <wp:docPr id="1" name="" descr="" title=""/>
+            <wp:cNvGraphicFramePr>
+              <a:graphicFrameLocks xmlns:a="http://schemas.openxmlformats.org/drawingml/2006/main" noChangeAspect="1"/>
+            </wp:cNvGraphicFramePr>
+            <a:graphic xmlns:a="http://schemas.openxmlformats.org/drawingml/2006/main">
+              <a:graphicData uri="http://schemas.openxmlformats.org/drawingml/2006/picture">
+                <pic:pic xmlns:pic="http://schemas.openxmlformats.org/drawingml/2006/picture">
+                  <pic:nvPicPr>
+                    <pic:cNvPr id="0" name="" descr=""/>
+                    <pic:cNvPicPr>
+                      <a:picLocks noChangeAspect="1" noChangeArrowheads="1"/>
+                    </pic:cNvPicPr>
+                  </pic:nvPicPr>
+                  <pic:blipFill>
+                    <a:blip r:embed="rId7" cstate="none"/>
+                    <a:srcRect/>
+                    <a:stretch>
+                      <a:fillRect/>
+                    </a:stretch>
+                  </pic:blipFill>
+                  <pic:spPr bwMode="auto">
+                    <a:xfrm>
+                      <a:off x="0" y="0"/>
+                      <a:ext cx="6000750" cy="6772275"/>
+                    </a:xfrm>
+                    <a:prstGeom prst="rect">
+                      <a:avLst/>
+                    </a:prstGeom>
+                  </pic:spPr>
+                </pic:pic>
+              </a:graphicData>
+            </a:graphic>
+          </wp:inline>
+        </w:drawing>
+      </w:r>
+    </w:p>
+    <w:p>
+      <w:pPr>
+        <w:spacing w:after="200" w:before="0"/>
+      </w:pPr>
+      <w:r>
+        <w:rPr>
+          <w:color w:val="5C6670"/>
+          <w:sz w:val="19"/>
+          <w:szCs w:val="19"/>
+        </w:rPr>
+        <w:t xml:space="preserve">Task goes down, result comes up, and every loop ends at Hub. There is no sideways link between workers.</w:t>
+      </w:r>
+    </w:p>
+    <w:p>
+      <w:r>
+        <w:br w:type="page"/>
+      </w:r>
+    </w:p>
+    <w:p>
+      <w:pPr>
+        <w:pStyle w:val="Heading2"/>
+        <w:spacing w:after="120" w:before="300"/>
+      </w:pPr>
+      <w:r>
+        <w:rPr>
+          <w:b/>
+          <w:bCs/>
+          <w:color w:val="1A1D21"/>
+          <w:sz w:val="26"/>
+          <w:szCs w:val="26"/>
+        </w:rPr>
+        <w:t xml:space="preserve">Who can see whom</w:t>
+      </w:r>
+    </w:p>
+    <w:p>
+      <w:pPr>
+        <w:spacing w:after="140"/>
+      </w:pPr>
+      <w:r>
+        <w:drawing>
+          <wp:inline distT="0" distB="0" distL="0" distR="0">
+            <wp:extent cx="6000750" cy="3209925"/>
+            <wp:effectExtent t="0" r="0" b="0" l="0"/>
+            <wp:docPr id="1" name="" descr="" title=""/>
+            <wp:cNvGraphicFramePr>
+              <a:graphicFrameLocks xmlns:a="http://schemas.openxmlformats.org/drawingml/2006/main" noChangeAspect="1"/>
+            </wp:cNvGraphicFramePr>
+            <a:graphic xmlns:a="http://schemas.openxmlformats.org/drawingml/2006/main">
+              <a:graphicData uri="http://schemas.openxmlformats.org/drawingml/2006/picture">
+                <pic:pic xmlns:pic="http://schemas.openxmlformats.org/drawingml/2006/picture">
+                  <pic:nvPicPr>
+                    <pic:cNvPr id="0" name="" descr=""/>
+                    <pic:cNvPicPr>
+                      <a:picLocks noChangeAspect="1" noChangeArrowheads="1"/>
+                    </pic:cNvPicPr>
+                  </pic:nvPicPr>
+                  <pic:blipFill>
+                    <a:blip r:embed="rId8" cstate="none"/>
+                    <a:srcRect/>
+                    <a:stretch>
+                      <a:fillRect/>
+                    </a:stretch>
+                  </pic:blipFill>
+                  <pic:spPr bwMode="auto">
+                    <a:xfrm>
+                      <a:off x="0" y="0"/>
+                      <a:ext cx="6000750" cy="3209925"/>
+                    </a:xfrm>
+                    <a:prstGeom prst="rect">
+                      <a:avLst/>
+                    </a:prstGeom>
+                  </pic:spPr>
+                </pic:pic>
+              </a:graphicData>
+            </a:graphic>
+          </wp:inline>
+        </w:drawing>
+      </w:r>
+    </w:p>
+    <w:p>
+      <w:pPr>
+        <w:spacing w:after="200" w:before="0"/>
+      </w:pPr>
+      <w:r>
+        <w:rPr>
+          <w:color w:val="5C6670"/>
+          <w:sz w:val="19"/>
+          <w:szCs w:val="19"/>
+        </w:rPr>
+        <w:t xml:space="preserve">Four separate memory pools. Each wall is a branch in the orchestrator, not an instruction in a prompt — which is why they hold.</w:t>
+      </w:r>
+    </w:p>
+    <w:p>
+      <w:pPr>
+        <w:pStyle w:val="Heading2"/>
+        <w:spacing w:after="120" w:before="300"/>
+      </w:pPr>
+      <w:r>
+        <w:rPr>
+          <w:b/>
+          <w:bCs/>
+          <w:color w:val="1A1D21"/>
+          <w:sz w:val="26"/>
+          <w:szCs w:val="26"/>
+        </w:rPr>
+        <w:t xml:space="preserve">Reading the map</w:t>
+      </w:r>
+    </w:p>
+    <w:tbl>
+      <w:tblPr>
+        <w:tblW w:type="dxa" w:w="9000"/>
+        <w:tblBorders>
+          <w:top w:val="single" w:color="C8CDD4" w:sz="4"/>
+          <w:left w:val="none"/>
+          <w:bottom w:val="single" w:color="C8CDD4" w:sz="4"/>
+          <w:right w:val="none"/>
+          <w:insideH w:val="single" w:color="DCE0E6" w:sz="2"/>
+          <w:insideV w:val="none"/>
+        </w:tblBorders>
+      </w:tblPr>
+      <w:tblGrid>
+        <w:gridCol w:w="2200"/>
+        <w:gridCol w:w="6800"/>
+      </w:tblGrid>
+      <w:tr>
+        <w:trPr>
+          <w:tblHeader/>
+        </w:trPr>
+        <w:tc>
+          <w:tcPr>
+            <w:tcW w:type="dxa" w:w="2200"/>
+            <w:shd w:fill="EDEFF2" w:color="auto" w:val="clear"/>
+            <w:tcMar>
+              <w:top w:type="dxa" w:w="90"/>
+              <w:left w:type="dxa" w:w="120"/>
+              <w:bottom w:type="dxa" w:w="90"/>
+              <w:right w:type="dxa" w:w="120"/>
+            </w:tcMar>
+          </w:tcPr>
+          <w:p>
+            <w:pPr>
+              <w:spacing w:after="0"/>
+            </w:pPr>
+            <w:r>
+              <w:rPr>
+                <w:b/>
+                <w:bCs/>
+                <w:color w:val="5C6670"/>
+                <w:sz w:val="17"/>
+                <w:szCs w:val="17"/>
+              </w:rPr>
+              <w:t xml:space="preserve">On the map</w:t>
+            </w:r>
+          </w:p>
+        </w:tc>
+        <w:tc>
+          <w:tcPr>
+            <w:tcW w:type="dxa" w:w="6800"/>
+            <w:shd w:fill="EDEFF2" w:color="auto" w:val="clear"/>
+            <w:tcMar>
+              <w:top w:type="dxa" w:w="90"/>
+              <w:left w:type="dxa" w:w="120"/>
+              <w:bottom w:type="dxa" w:w="90"/>
+              <w:right w:type="dxa" w:w="120"/>
+            </w:tcMar>
+          </w:tcPr>
+          <w:p>
+            <w:pPr>
+              <w:spacing w:after="0"/>
+            </w:pPr>
+            <w:r>
+              <w:rPr>
+                <w:b/>
+                <w:bCs/>
+                <w:color w:val="5C6670"/>
+                <w:sz w:val="17"/>
+                <w:szCs w:val="17"/>
+              </w:rPr>
+              <w:t xml:space="preserve">What it means</w:t>
+            </w:r>
+          </w:p>
+        </w:tc>
+      </w:tr>
+      <w:tr>
+        <w:tc>
+          <w:tcPr>
+            <w:tcW w:type="dxa" w:w="2200"/>
+            <w:tcMar>
+              <w:top w:type="dxa" w:w="90"/>
+              <w:left w:type="dxa" w:w="120"/>
+              <w:bottom w:type="dxa" w:w="90"/>
+              <w:right w:type="dxa" w:w="120"/>
+            </w:tcMar>
+          </w:tcPr>
+          <w:p>
+            <w:pPr>
+              <w:spacing w:after="0"/>
+            </w:pPr>
+            <w:r>
+              <w:rPr>
+                <w:color w:val="1A1D21"/>
+                <w:sz w:val="20"/>
+                <w:szCs w:val="20"/>
+              </w:rPr>
+              <w:t xml:space="preserve">Solid arrow</w:t>
+            </w:r>
+          </w:p>
+        </w:tc>
+        <w:tc>
+          <w:tcPr>
+            <w:tcW w:type="dxa" w:w="6800"/>
+            <w:tcMar>
+              <w:top w:type="dxa" w:w="90"/>
+              <w:left w:type="dxa" w:w="120"/>
+              <w:bottom w:type="dxa" w:w="90"/>
+              <w:right w:type="dxa" w:w="120"/>
+            </w:tcMar>
+          </w:tcPr>
+          <w:p>
+            <w:pPr>
+              <w:spacing w:after="0"/>
+            </w:pPr>
+            <w:r>
+              <w:rPr>
+                <w:color w:val="1A1D21"/>
+                <w:sz w:val="20"/>
+                <w:szCs w:val="20"/>
+              </w:rPr>
+              <w:t xml:space="preserve">Task passed down, result returned up. The only path work travels.</w:t>
+            </w:r>
+          </w:p>
+        </w:tc>
+      </w:tr>
+      <w:tr>
+        <w:tc>
+          <w:tcPr>
+            <w:tcW w:type="dxa" w:w="2200"/>
+            <w:tcMar>
+              <w:top w:type="dxa" w:w="90"/>
+              <w:left w:type="dxa" w:w="120"/>
+              <w:bottom w:type="dxa" w:w="90"/>
+              <w:right w:type="dxa" w:w="120"/>
+            </w:tcMar>
+          </w:tcPr>
+          <w:p>
+            <w:pPr>
+              <w:spacing w:after="0"/>
+            </w:pPr>
+            <w:r>
+              <w:rPr>
+                <w:color w:val="1A1D21"/>
+                <w:sz w:val="20"/>
+                <w:szCs w:val="20"/>
+              </w:rPr>
+              <w:t xml:space="preserve">Dashed line</w:t>
+            </w:r>
+          </w:p>
+        </w:tc>
+        <w:tc>
+          <w:tcPr>
+            <w:tcW w:type="dxa" w:w="6800"/>
+            <w:tcMar>
+              <w:top w:type="dxa" w:w="90"/>
+              <w:left w:type="dxa" w:w="120"/>
+              <w:bottom w:type="dxa" w:w="90"/>
+              <w:right w:type="dxa" w:w="120"/>
+            </w:tcMar>
+          </w:tcPr>
+          <w:p>
+            <w:pPr>
+              <w:spacing w:after="0"/>
+            </w:pPr>
+            <w:r>
+              <w:rPr>
+                <w:color w:val="1A1D21"/>
+                <w:sz w:val="20"/>
+                <w:szCs w:val="20"/>
+              </w:rPr>
+              <w:t xml:space="preserve">Reads or records. No authority to act on what it sees.</w:t>
+            </w:r>
+          </w:p>
+        </w:tc>
+      </w:tr>
+      <w:tr>
+        <w:tc>
+          <w:tcPr>
+            <w:tcW w:type="dxa" w:w="2200"/>
+            <w:tcMar>
+              <w:top w:type="dxa" w:w="90"/>
+              <w:left w:type="dxa" w:w="120"/>
+              <w:bottom w:type="dxa" w:w="90"/>
+              <w:right w:type="dxa" w:w="120"/>
+            </w:tcMar>
+          </w:tcPr>
+          <w:p>
+            <w:pPr>
+              <w:spacing w:after="0"/>
+            </w:pPr>
+            <w:r>
+              <w:rPr>
+                <w:color w:val="1A1D21"/>
+                <w:sz w:val="20"/>
+                <w:szCs w:val="20"/>
+              </w:rPr>
+              <w:t xml:space="preserve">Dashed gold box</w:t>
+            </w:r>
+          </w:p>
+        </w:tc>
+        <w:tc>
+          <w:tcPr>
+            <w:tcW w:type="dxa" w:w="6800"/>
+            <w:tcMar>
+              <w:top w:type="dxa" w:w="90"/>
+              <w:left w:type="dxa" w:w="120"/>
+              <w:bottom w:type="dxa" w:w="90"/>
+              <w:right w:type="dxa" w:w="120"/>
+            </w:tcMar>
+          </w:tcPr>
+          <w:p>
+            <w:pPr>
+              <w:spacing w:after="0"/>
+            </w:pPr>
+            <w:r>
+              <w:rPr>
+                <w:color w:val="1A1D21"/>
+                <w:sz w:val="20"/>
+                <w:szCs w:val="20"/>
+              </w:rPr>
+              <w:t xml:space="preserve">A sealed pair. They see each other and nothing else, and nothing they say leaves.</w:t>
+            </w:r>
+          </w:p>
+        </w:tc>
+      </w:tr>
+      <w:tr>
+        <w:tc>
+          <w:tcPr>
+            <w:tcW w:type="dxa" w:w="2200"/>
+            <w:tcMar>
+              <w:top w:type="dxa" w:w="90"/>
+              <w:left w:type="dxa" w:w="120"/>
+              <w:bottom w:type="dxa" w:w="90"/>
+              <w:right w:type="dxa" w:w="120"/>
+            </w:tcMar>
+          </w:tcPr>
+          <w:p>
+            <w:pPr>
+              <w:spacing w:after="0"/>
+            </w:pPr>
+            <w:r>
+              <w:rPr>
+                <w:color w:val="1A1D21"/>
+                <w:sz w:val="20"/>
+                <w:szCs w:val="20"/>
+              </w:rPr>
+              <w:t xml:space="preserve">Red box</w:t>
+            </w:r>
+          </w:p>
+        </w:tc>
+        <w:tc>
+          <w:tcPr>
+            <w:tcW w:type="dxa" w:w="6800"/>
+            <w:tcMar>
+              <w:top w:type="dxa" w:w="90"/>
+              <w:left w:type="dxa" w:w="120"/>
+              <w:bottom w:type="dxa" w:w="90"/>
+              <w:right w:type="dxa" w:w="120"/>
+            </w:tcMar>
+          </w:tcPr>
+          <w:p>
+            <w:pPr>
+              <w:spacing w:after="0"/>
+            </w:pPr>
+            <w:r>
+              <w:rPr>
+                <w:color w:val="1A1D21"/>
+                <w:sz w:val="20"/>
+                <w:szCs w:val="20"/>
+              </w:rPr>
+              <w:t xml:space="preserve">The gate. Everything reaching a real service passes through it.</w:t>
+            </w:r>
+          </w:p>
+        </w:tc>
+      </w:tr>
+      <w:tr>
+        <w:tc>
+          <w:tcPr>
+            <w:tcW w:type="dxa" w:w="2200"/>
+            <w:tcMar>
+              <w:top w:type="dxa" w:w="90"/>
+              <w:left w:type="dxa" w:w="120"/>
+              <w:bottom w:type="dxa" w:w="90"/>
+              <w:right w:type="dxa" w:w="120"/>
+            </w:tcMar>
+          </w:tcPr>
+          <w:p>
+            <w:pPr>
+              <w:spacing w:after="0"/>
+            </w:pPr>
+            <w:r>
+              <w:rPr>
+                <w:color w:val="1A1D21"/>
+                <w:sz w:val="20"/>
+                <w:szCs w:val="20"/>
+              </w:rPr>
+              <w:t xml:space="preserve">Black box</w:t>
+            </w:r>
+          </w:p>
+        </w:tc>
+        <w:tc>
+          <w:tcPr>
+            <w:tcW w:type="dxa" w:w="6800"/>
+            <w:tcMar>
+              <w:top w:type="dxa" w:w="90"/>
+              <w:left w:type="dxa" w:w="120"/>
+              <w:bottom w:type="dxa" w:w="90"/>
+              <w:right w:type="dxa" w:w="120"/>
+            </w:tcMar>
+          </w:tcPr>
+          <w:p>
+            <w:pPr>
+              <w:spacing w:after="0"/>
+            </w:pPr>
+            <w:r>
+              <w:rPr>
+                <w:color w:val="1A1D21"/>
+                <w:sz w:val="20"/>
+                <w:szCs w:val="20"/>
+              </w:rPr>
+              <w:t xml:space="preserve">Sam, Hub and the outside service — the three points that decide or receive.</w:t>
+            </w:r>
+          </w:p>
+        </w:tc>
+      </w:tr>
+    </w:tbl>
+    <w:p>
+      <w:pPr>
+        <w:spacing w:after="120" w:before="0"/>
+      </w:pPr>
+      <w:r>
+        <w:rPr>
+          <w:color w:val="1A1D21"/>
+          <w:sz w:val="21"/>
+          <w:szCs w:val="21"/>
+        </w:rPr>
+        <w:t xml:space="preserve">Three things are worth reading off the map directly. Nova sits at the top but decides nothing — she is the mouth, not the brain. The permission layer sits between every worker and Gmail, so no worker holds a tool. And oversight sits underneath everything, running after the fact with no ability to act on what it finds.</w:t>
+      </w:r>
+    </w:p>
+    <w:p>
+      <w:r>
+        <w:br w:type="page"/>
+      </w:r>
+    </w:p>
+    <w:p>
+      <w:pPr>
+        <w:pStyle w:val="Heading1"/>
+        <w:spacing w:after="160" w:before="360"/>
+      </w:pPr>
+      <w:r>
+        <w:rPr>
+          <w:b/>
+          <w:bCs/>
+          <w:color w:val="1A1D21"/>
+          <w:sz w:val="32"/>
+          <w:szCs w:val="32"/>
+        </w:rPr>
+        <w:t xml:space="preserve">Part Two — The Guardrails</w:t>
       </w:r>
     </w:p>
     <w:p>
@@ -1777,6 +2579,11 @@
       </w:r>
     </w:p>
     <w:p>
+      <w:r>
+        <w:br w:type="page"/>
+      </w:r>
+    </w:p>
+    <w:p>
       <w:pPr>
         <w:pStyle w:val="Heading1"/>
         <w:spacing w:after="160" w:before="360"/>
@@ -1789,549 +2596,7 @@
           <w:sz w:val="32"/>
           <w:szCs w:val="32"/>
         </w:rPr>
-        <w:t xml:space="preserve">Part Two — The Map</w:t>
-      </w:r>
-    </w:p>
-    <w:p>
-      <w:pPr>
-        <w:spacing w:after="200" w:before="0"/>
-      </w:pPr>
-      <w:r>
-        <w:rPr>
-          <w:color w:val="5C6670"/>
-          <w:sz w:val="21"/>
-          <w:szCs w:val="21"/>
-        </w:rPr>
-        <w:t xml:space="preserve">How a request moves through the system, and who is connected to whom.</w:t>
-      </w:r>
-    </w:p>
-    <w:p>
-      <w:pPr>
-        <w:pStyle w:val="Heading2"/>
-        <w:spacing w:after="120" w:before="300"/>
-      </w:pPr>
-      <w:r>
-        <w:rPr>
-          <w:b/>
-          <w:bCs/>
-          <w:color w:val="1A1D21"/>
-          <w:sz w:val="26"/>
-          <w:szCs w:val="26"/>
-        </w:rPr>
-        <w:t xml:space="preserve">The chain</w:t>
-      </w:r>
-    </w:p>
-    <w:p>
-      <w:pPr>
-        <w:spacing w:after="140"/>
-      </w:pPr>
-      <w:r>
-        <w:drawing>
-          <wp:inline distT="0" distB="0" distL="0" distR="0">
-            <wp:extent cx="6000750" cy="6772275"/>
-            <wp:effectExtent t="0" r="0" b="0" l="0"/>
-            <wp:docPr id="1" name="" descr="" title=""/>
-            <wp:cNvGraphicFramePr>
-              <a:graphicFrameLocks xmlns:a="http://schemas.openxmlformats.org/drawingml/2006/main" noChangeAspect="1"/>
-            </wp:cNvGraphicFramePr>
-            <a:graphic xmlns:a="http://schemas.openxmlformats.org/drawingml/2006/main">
-              <a:graphicData uri="http://schemas.openxmlformats.org/drawingml/2006/picture">
-                <pic:pic xmlns:pic="http://schemas.openxmlformats.org/drawingml/2006/picture">
-                  <pic:nvPicPr>
-                    <pic:cNvPr id="0" name="" descr=""/>
-                    <pic:cNvPicPr>
-                      <a:picLocks noChangeAspect="1" noChangeArrowheads="1"/>
-                    </pic:cNvPicPr>
-                  </pic:nvPicPr>
-                  <pic:blipFill>
-                    <a:blip r:embed="rId7" cstate="none"/>
-                    <a:srcRect/>
-                    <a:stretch>
-                      <a:fillRect/>
-                    </a:stretch>
-                  </pic:blipFill>
-                  <pic:spPr bwMode="auto">
-                    <a:xfrm>
-                      <a:off x="0" y="0"/>
-                      <a:ext cx="6000750" cy="6772275"/>
-                    </a:xfrm>
-                    <a:prstGeom prst="rect">
-                      <a:avLst/>
-                    </a:prstGeom>
-                  </pic:spPr>
-                </pic:pic>
-              </a:graphicData>
-            </a:graphic>
-          </wp:inline>
-        </w:drawing>
-      </w:r>
-    </w:p>
-    <w:p>
-      <w:pPr>
-        <w:spacing w:after="200" w:before="0"/>
-      </w:pPr>
-      <w:r>
-        <w:rPr>
-          <w:color w:val="5C6670"/>
-          <w:sz w:val="19"/>
-          <w:szCs w:val="19"/>
-        </w:rPr>
-        <w:t xml:space="preserve">Task goes down, result comes up, and every loop ends at Hub. There is no sideways link between workers.</w:t>
-      </w:r>
-    </w:p>
-    <w:p>
-      <w:r>
-        <w:br w:type="page"/>
-      </w:r>
-    </w:p>
-    <w:p>
-      <w:pPr>
-        <w:pStyle w:val="Heading2"/>
-        <w:spacing w:after="120" w:before="300"/>
-      </w:pPr>
-      <w:r>
-        <w:rPr>
-          <w:b/>
-          <w:bCs/>
-          <w:color w:val="1A1D21"/>
-          <w:sz w:val="26"/>
-          <w:szCs w:val="26"/>
-        </w:rPr>
-        <w:t xml:space="preserve">Who can see whom</w:t>
-      </w:r>
-    </w:p>
-    <w:p>
-      <w:pPr>
-        <w:spacing w:after="140"/>
-      </w:pPr>
-      <w:r>
-        <w:drawing>
-          <wp:inline distT="0" distB="0" distL="0" distR="0">
-            <wp:extent cx="6000750" cy="3209925"/>
-            <wp:effectExtent t="0" r="0" b="0" l="0"/>
-            <wp:docPr id="1" name="" descr="" title=""/>
-            <wp:cNvGraphicFramePr>
-              <a:graphicFrameLocks xmlns:a="http://schemas.openxmlformats.org/drawingml/2006/main" noChangeAspect="1"/>
-            </wp:cNvGraphicFramePr>
-            <a:graphic xmlns:a="http://schemas.openxmlformats.org/drawingml/2006/main">
-              <a:graphicData uri="http://schemas.openxmlformats.org/drawingml/2006/picture">
-                <pic:pic xmlns:pic="http://schemas.openxmlformats.org/drawingml/2006/picture">
-                  <pic:nvPicPr>
-                    <pic:cNvPr id="0" name="" descr=""/>
-                    <pic:cNvPicPr>
-                      <a:picLocks noChangeAspect="1" noChangeArrowheads="1"/>
-                    </pic:cNvPicPr>
-                  </pic:nvPicPr>
-                  <pic:blipFill>
-                    <a:blip r:embed="rId8" cstate="none"/>
-                    <a:srcRect/>
-                    <a:stretch>
-                      <a:fillRect/>
-                    </a:stretch>
-                  </pic:blipFill>
-                  <pic:spPr bwMode="auto">
-                    <a:xfrm>
-                      <a:off x="0" y="0"/>
-                      <a:ext cx="6000750" cy="3209925"/>
-                    </a:xfrm>
-                    <a:prstGeom prst="rect">
-                      <a:avLst/>
-                    </a:prstGeom>
-                  </pic:spPr>
-                </pic:pic>
-              </a:graphicData>
-            </a:graphic>
-          </wp:inline>
-        </w:drawing>
-      </w:r>
-    </w:p>
-    <w:p>
-      <w:pPr>
-        <w:spacing w:after="200" w:before="0"/>
-      </w:pPr>
-      <w:r>
-        <w:rPr>
-          <w:color w:val="5C6670"/>
-          <w:sz w:val="19"/>
-          <w:szCs w:val="19"/>
-        </w:rPr>
-        <w:t xml:space="preserve">Four separate memory pools. Each wall is a branch in the orchestrator, not an instruction in a prompt — which is why they hold.</w:t>
-      </w:r>
-    </w:p>
-    <w:p>
-      <w:pPr>
-        <w:pStyle w:val="Heading2"/>
-        <w:spacing w:after="120" w:before="300"/>
-      </w:pPr>
-      <w:r>
-        <w:rPr>
-          <w:b/>
-          <w:bCs/>
-          <w:color w:val="1A1D21"/>
-          <w:sz w:val="26"/>
-          <w:szCs w:val="26"/>
-        </w:rPr>
-        <w:t xml:space="preserve">Reading the map</w:t>
-      </w:r>
-    </w:p>
-    <w:tbl>
-      <w:tblPr>
-        <w:tblW w:type="dxa" w:w="9000"/>
-        <w:tblBorders>
-          <w:top w:val="single" w:color="C8CDD4" w:sz="4"/>
-          <w:left w:val="none"/>
-          <w:bottom w:val="single" w:color="C8CDD4" w:sz="4"/>
-          <w:right w:val="none"/>
-          <w:insideH w:val="single" w:color="DCE0E6" w:sz="2"/>
-          <w:insideV w:val="none"/>
-        </w:tblBorders>
-      </w:tblPr>
-      <w:tblGrid>
-        <w:gridCol w:w="2200"/>
-        <w:gridCol w:w="6800"/>
-      </w:tblGrid>
-      <w:tr>
-        <w:trPr>
-          <w:tblHeader/>
-        </w:trPr>
-        <w:tc>
-          <w:tcPr>
-            <w:tcW w:type="dxa" w:w="2200"/>
-            <w:shd w:fill="EDEFF2" w:color="auto" w:val="clear"/>
-            <w:tcMar>
-              <w:top w:type="dxa" w:w="90"/>
-              <w:left w:type="dxa" w:w="120"/>
-              <w:bottom w:type="dxa" w:w="90"/>
-              <w:right w:type="dxa" w:w="120"/>
-            </w:tcMar>
-          </w:tcPr>
-          <w:p>
-            <w:pPr>
-              <w:spacing w:after="0"/>
-            </w:pPr>
-            <w:r>
-              <w:rPr>
-                <w:b/>
-                <w:bCs/>
-                <w:color w:val="5C6670"/>
-                <w:sz w:val="17"/>
-                <w:szCs w:val="17"/>
-              </w:rPr>
-              <w:t xml:space="preserve">On the map</w:t>
-            </w:r>
-          </w:p>
-        </w:tc>
-        <w:tc>
-          <w:tcPr>
-            <w:tcW w:type="dxa" w:w="6800"/>
-            <w:shd w:fill="EDEFF2" w:color="auto" w:val="clear"/>
-            <w:tcMar>
-              <w:top w:type="dxa" w:w="90"/>
-              <w:left w:type="dxa" w:w="120"/>
-              <w:bottom w:type="dxa" w:w="90"/>
-              <w:right w:type="dxa" w:w="120"/>
-            </w:tcMar>
-          </w:tcPr>
-          <w:p>
-            <w:pPr>
-              <w:spacing w:after="0"/>
-            </w:pPr>
-            <w:r>
-              <w:rPr>
-                <w:b/>
-                <w:bCs/>
-                <w:color w:val="5C6670"/>
-                <w:sz w:val="17"/>
-                <w:szCs w:val="17"/>
-              </w:rPr>
-              <w:t xml:space="preserve">What it means</w:t>
-            </w:r>
-          </w:p>
-        </w:tc>
-      </w:tr>
-      <w:tr>
-        <w:tc>
-          <w:tcPr>
-            <w:tcW w:type="dxa" w:w="2200"/>
-            <w:tcMar>
-              <w:top w:type="dxa" w:w="90"/>
-              <w:left w:type="dxa" w:w="120"/>
-              <w:bottom w:type="dxa" w:w="90"/>
-              <w:right w:type="dxa" w:w="120"/>
-            </w:tcMar>
-          </w:tcPr>
-          <w:p>
-            <w:pPr>
-              <w:spacing w:after="0"/>
-            </w:pPr>
-            <w:r>
-              <w:rPr>
-                <w:color w:val="1A1D21"/>
-                <w:sz w:val="20"/>
-                <w:szCs w:val="20"/>
-              </w:rPr>
-              <w:t xml:space="preserve">Solid arrow</w:t>
-            </w:r>
-          </w:p>
-        </w:tc>
-        <w:tc>
-          <w:tcPr>
-            <w:tcW w:type="dxa" w:w="6800"/>
-            <w:tcMar>
-              <w:top w:type="dxa" w:w="90"/>
-              <w:left w:type="dxa" w:w="120"/>
-              <w:bottom w:type="dxa" w:w="90"/>
-              <w:right w:type="dxa" w:w="120"/>
-            </w:tcMar>
-          </w:tcPr>
-          <w:p>
-            <w:pPr>
-              <w:spacing w:after="0"/>
-            </w:pPr>
-            <w:r>
-              <w:rPr>
-                <w:color w:val="1A1D21"/>
-                <w:sz w:val="20"/>
-                <w:szCs w:val="20"/>
-              </w:rPr>
-              <w:t xml:space="preserve">Task passed down, result returned up. The only path work travels.</w:t>
-            </w:r>
-          </w:p>
-        </w:tc>
-      </w:tr>
-      <w:tr>
-        <w:tc>
-          <w:tcPr>
-            <w:tcW w:type="dxa" w:w="2200"/>
-            <w:tcMar>
-              <w:top w:type="dxa" w:w="90"/>
-              <w:left w:type="dxa" w:w="120"/>
-              <w:bottom w:type="dxa" w:w="90"/>
-              <w:right w:type="dxa" w:w="120"/>
-            </w:tcMar>
-          </w:tcPr>
-          <w:p>
-            <w:pPr>
-              <w:spacing w:after="0"/>
-            </w:pPr>
-            <w:r>
-              <w:rPr>
-                <w:color w:val="1A1D21"/>
-                <w:sz w:val="20"/>
-                <w:szCs w:val="20"/>
-              </w:rPr>
-              <w:t xml:space="preserve">Dashed line</w:t>
-            </w:r>
-          </w:p>
-        </w:tc>
-        <w:tc>
-          <w:tcPr>
-            <w:tcW w:type="dxa" w:w="6800"/>
-            <w:tcMar>
-              <w:top w:type="dxa" w:w="90"/>
-              <w:left w:type="dxa" w:w="120"/>
-              <w:bottom w:type="dxa" w:w="90"/>
-              <w:right w:type="dxa" w:w="120"/>
-            </w:tcMar>
-          </w:tcPr>
-          <w:p>
-            <w:pPr>
-              <w:spacing w:after="0"/>
-            </w:pPr>
-            <w:r>
-              <w:rPr>
-                <w:color w:val="1A1D21"/>
-                <w:sz w:val="20"/>
-                <w:szCs w:val="20"/>
-              </w:rPr>
-              <w:t xml:space="preserve">Reads or records. No authority to act on what it sees.</w:t>
-            </w:r>
-          </w:p>
-        </w:tc>
-      </w:tr>
-      <w:tr>
-        <w:tc>
-          <w:tcPr>
-            <w:tcW w:type="dxa" w:w="2200"/>
-            <w:tcMar>
-              <w:top w:type="dxa" w:w="90"/>
-              <w:left w:type="dxa" w:w="120"/>
-              <w:bottom w:type="dxa" w:w="90"/>
-              <w:right w:type="dxa" w:w="120"/>
-            </w:tcMar>
-          </w:tcPr>
-          <w:p>
-            <w:pPr>
-              <w:spacing w:after="0"/>
-            </w:pPr>
-            <w:r>
-              <w:rPr>
-                <w:color w:val="1A1D21"/>
-                <w:sz w:val="20"/>
-                <w:szCs w:val="20"/>
-              </w:rPr>
-              <w:t xml:space="preserve">Dashed gold box</w:t>
-            </w:r>
-          </w:p>
-        </w:tc>
-        <w:tc>
-          <w:tcPr>
-            <w:tcW w:type="dxa" w:w="6800"/>
-            <w:tcMar>
-              <w:top w:type="dxa" w:w="90"/>
-              <w:left w:type="dxa" w:w="120"/>
-              <w:bottom w:type="dxa" w:w="90"/>
-              <w:right w:type="dxa" w:w="120"/>
-            </w:tcMar>
-          </w:tcPr>
-          <w:p>
-            <w:pPr>
-              <w:spacing w:after="0"/>
-            </w:pPr>
-            <w:r>
-              <w:rPr>
-                <w:color w:val="1A1D21"/>
-                <w:sz w:val="20"/>
-                <w:szCs w:val="20"/>
-              </w:rPr>
-              <w:t xml:space="preserve">A sealed pair. They see each other and nothing else, and nothing they say leaves.</w:t>
-            </w:r>
-          </w:p>
-        </w:tc>
-      </w:tr>
-      <w:tr>
-        <w:tc>
-          <w:tcPr>
-            <w:tcW w:type="dxa" w:w="2200"/>
-            <w:tcMar>
-              <w:top w:type="dxa" w:w="90"/>
-              <w:left w:type="dxa" w:w="120"/>
-              <w:bottom w:type="dxa" w:w="90"/>
-              <w:right w:type="dxa" w:w="120"/>
-            </w:tcMar>
-          </w:tcPr>
-          <w:p>
-            <w:pPr>
-              <w:spacing w:after="0"/>
-            </w:pPr>
-            <w:r>
-              <w:rPr>
-                <w:color w:val="1A1D21"/>
-                <w:sz w:val="20"/>
-                <w:szCs w:val="20"/>
-              </w:rPr>
-              <w:t xml:space="preserve">Red box</w:t>
-            </w:r>
-          </w:p>
-        </w:tc>
-        <w:tc>
-          <w:tcPr>
-            <w:tcW w:type="dxa" w:w="6800"/>
-            <w:tcMar>
-              <w:top w:type="dxa" w:w="90"/>
-              <w:left w:type="dxa" w:w="120"/>
-              <w:bottom w:type="dxa" w:w="90"/>
-              <w:right w:type="dxa" w:w="120"/>
-            </w:tcMar>
-          </w:tcPr>
-          <w:p>
-            <w:pPr>
-              <w:spacing w:after="0"/>
-            </w:pPr>
-            <w:r>
-              <w:rPr>
-                <w:color w:val="1A1D21"/>
-                <w:sz w:val="20"/>
-                <w:szCs w:val="20"/>
-              </w:rPr>
-              <w:t xml:space="preserve">The gate. Everything reaching a real service passes through it.</w:t>
-            </w:r>
-          </w:p>
-        </w:tc>
-      </w:tr>
-      <w:tr>
-        <w:tc>
-          <w:tcPr>
-            <w:tcW w:type="dxa" w:w="2200"/>
-            <w:tcMar>
-              <w:top w:type="dxa" w:w="90"/>
-              <w:left w:type="dxa" w:w="120"/>
-              <w:bottom w:type="dxa" w:w="90"/>
-              <w:right w:type="dxa" w:w="120"/>
-            </w:tcMar>
-          </w:tcPr>
-          <w:p>
-            <w:pPr>
-              <w:spacing w:after="0"/>
-            </w:pPr>
-            <w:r>
-              <w:rPr>
-                <w:color w:val="1A1D21"/>
-                <w:sz w:val="20"/>
-                <w:szCs w:val="20"/>
-              </w:rPr>
-              <w:t xml:space="preserve">Black box</w:t>
-            </w:r>
-          </w:p>
-        </w:tc>
-        <w:tc>
-          <w:tcPr>
-            <w:tcW w:type="dxa" w:w="6800"/>
-            <w:tcMar>
-              <w:top w:type="dxa" w:w="90"/>
-              <w:left w:type="dxa" w:w="120"/>
-              <w:bottom w:type="dxa" w:w="90"/>
-              <w:right w:type="dxa" w:w="120"/>
-            </w:tcMar>
-          </w:tcPr>
-          <w:p>
-            <w:pPr>
-              <w:spacing w:after="0"/>
-            </w:pPr>
-            <w:r>
-              <w:rPr>
-                <w:color w:val="1A1D21"/>
-                <w:sz w:val="20"/>
-                <w:szCs w:val="20"/>
-              </w:rPr>
-              <w:t xml:space="preserve">Sam, Hub and the outside service — the three points that decide or receive.</w:t>
-            </w:r>
-          </w:p>
-        </w:tc>
-      </w:tr>
-    </w:tbl>
-    <w:p>
-      <w:pPr>
-        <w:spacing w:after="120" w:before="0"/>
-      </w:pPr>
-      <w:r>
-        <w:rPr>
-          <w:color w:val="1A1D21"/>
-          <w:sz w:val="21"/>
-          <w:szCs w:val="21"/>
-        </w:rPr>
-        <w:t xml:space="preserve">Three things are worth reading off the map directly. Nova sits at the top but decides nothing — she is the mouth, not the brain. The permission layer sits between every worker and Gmail, so no worker holds a tool. And oversight sits underneath everything, running after the fact with no ability to act on what it finds.</w:t>
-      </w:r>
-    </w:p>
-    <w:p>
-      <w:r>
-        <w:br w:type="page"/>
-      </w:r>
-    </w:p>
-    <w:p>
-      <w:pPr>
-        <w:pStyle w:val="Heading1"/>
-        <w:spacing w:after="160" w:before="360"/>
-      </w:pPr>
-      <w:r>
-        <w:rPr>
-          <w:b/>
-          <w:bCs/>
-          <w:color w:val="1A1D21"/>
-          <w:sz w:val="32"/>
-          <w:szCs w:val="32"/>
-        </w:rPr>
-        <w:t xml:space="preserve">Part Three — The Models</w:t>
+        <w:t xml:space="preserve">Part Three — The Rubrics</w:t>
       </w:r>
     </w:p>
     <w:p>

</xml_diff>

<commit_message>
Close the coding_worker proposal
Sam's decision: not to be built. builder already covers architecture,
code, debugging and deployment, and nothing was identified that a
separate coding worker would do differently.

Recorded as a closed decision in its own group rather than deleted, so
the proposal is not reopened without new grounds - which is the same
discipline the memory slot's own prompt asks for: raise an active
decision before a settled topic is reopened.

Coding work routes to builder. coding_worker stays absent from
slots_config.json and from the router roster.

Co-Authored-By: Claude Opus 5 <noreply@anthropic.com>
Claude-Session: https://claude.ai/code/session_01CV3yfiTKLESTajPt6khfV9
</commit_message>
<xml_diff>
--- a/Command_Desk_Rubrics_and_Guardrails.docx
+++ b/Command_Desk_Rubrics_and_Guardrails.docx
@@ -306,7 +306,7 @@
                 <w:sz w:val="20"/>
                 <w:szCs w:val="20"/>
               </w:rPr>
-              <w:t xml:space="preserve">Twenty-two agents in four groups. Each with purpose, measurable requirements, verification method, auto-fail conditions, output contract, and the guards holding it.</w:t>
+              <w:t xml:space="preserve">Twenty-two agents in five groups. Each with purpose, measurable requirements, verification method, auto-fail conditions, output contract, and the guards holding it.</w:t>
             </w:r>
           </w:p>
         </w:tc>
@@ -322,7 +322,7 @@
           <w:sz w:val="19"/>
           <w:szCs w:val="19"/>
         </w:rPr>
-        <w:t xml:space="preserve">Eleven are live. Two sit on the box with prompts written and are not in the config. Four are designed and specified. Five are named in the documents with no scope yet — their rubrics are containment rules, because an undefined slot needs guardrails more than a defined one, not fewer.</w:t>
+        <w:t xml:space="preserve">Eleven are live. Two sit on the box with prompts written and are not in the config. Four are designed and specified. Four are named in the documents with no scope yet — their rubrics are containment rules, because an undefined slot needs guardrails more than a defined one, not fewer. One has been decided against and is recorded as closed so it is not reopened.</w:t>
       </w:r>
     </w:p>
     <w:p>
@@ -9488,7 +9488,7 @@
           <w:sz w:val="26"/>
           <w:szCs w:val="26"/>
         </w:rPr>
-        <w:t xml:space="preserve">coding_worker</w:t>
+        <w:t xml:space="preserve">billing_agent</w:t>
       </w:r>
       <w:r>
         <w:rPr>
@@ -9497,7 +9497,7 @@
           <w:sz w:val="18"/>
           <w:szCs w:val="18"/>
         </w:rPr>
-        <w:t xml:space="preserve">   to be chosen  |  named as a Stage 5 clone</w:t>
+        <w:t xml:space="preserve">   to be chosen  |  named in the final roadmap</w:t>
       </w:r>
     </w:p>
     <w:p>
@@ -9512,7 +9512,7 @@
           <w:sz w:val="21"/>
           <w:szCs w:val="21"/>
         </w:rPr>
-        <w:t xml:space="preserve">Named in two documents as an example of cloning the proven pattern.</w:t>
+        <w:t xml:space="preserve">Appears once, in a worked example of the event flow. Not a specification.</w:t>
       </w:r>
     </w:p>
     <w:p>
@@ -9541,7 +9541,7 @@
           <w:sz w:val="21"/>
           <w:szCs w:val="21"/>
         </w:rPr>
-        <w:t xml:space="preserve">Not yet defined, and it overlaps builder, which already does architecture, code and shipping.</w:t>
+        <w:t xml:space="preserve">Not yet defined. It also collides with an existing rule.</w:t>
       </w:r>
     </w:p>
     <w:p>
@@ -9593,25 +9593,25 @@
           <w:sz w:val="21"/>
           <w:szCs w:val="21"/>
         </w:rPr>
-        <w:t xml:space="preserve">If built, it is a clone of the proven pattern — same router, same permission-layer shape, same gate, same log.</w:t>
-      </w:r>
-    </w:p>
-    <w:p>
-      <w:pPr>
-        <w:pStyle w:val="ListParagraph"/>
-        <w:numPr>
-          <w:ilvl w:val="0"/>
-          <w:numId w:val="3"/>
-        </w:numPr>
-        <w:spacing w:after="70"/>
-      </w:pPr>
-      <w:r>
-        <w:rPr>
-          <w:color w:val="1A1D21"/>
-          <w:sz w:val="21"/>
-          <w:szCs w:val="21"/>
-        </w:rPr>
-        <w:t xml:space="preserve">Its scope is written down before it is created.</w:t>
+        <w:t xml:space="preserve">Anything producing a quote or an invoice is an outward action and stops for Sam.</w:t>
+      </w:r>
+    </w:p>
+    <w:p>
+      <w:pPr>
+        <w:pStyle w:val="ListParagraph"/>
+        <w:numPr>
+          <w:ilvl w:val="0"/>
+          <w:numId w:val="3"/>
+        </w:numPr>
+        <w:spacing w:after="70"/>
+      </w:pPr>
+      <w:r>
+        <w:rPr>
+          <w:color w:val="1A1D21"/>
+          <w:sz w:val="21"/>
+          <w:szCs w:val="21"/>
+        </w:rPr>
+        <w:t xml:space="preserve">Figures are stated only from what was supplied — never estimated to look complete.</w:t>
       </w:r>
     </w:p>
     <w:p>
@@ -9640,7 +9640,7 @@
           <w:sz w:val="21"/>
           <w:szCs w:val="21"/>
         </w:rPr>
-        <w:t xml:space="preserve">Not applicable until its scope exists.</w:t>
+        <w:t xml:space="preserve">ground() against the request. The permission layer for anything outward.</w:t>
       </w:r>
     </w:p>
     <w:p>
@@ -9674,7 +9674,7 @@
           <w:sz w:val="21"/>
           <w:szCs w:val="21"/>
         </w:rPr>
-        <w:t xml:space="preserve">Being created without a written scope that distinguishes it from builder.</w:t>
+        <w:t xml:space="preserve">An invented amount, rate or reference.</w:t>
       </w:r>
     </w:p>
     <w:p>
@@ -9692,7 +9692,7 @@
           <w:sz w:val="21"/>
           <w:szCs w:val="21"/>
         </w:rPr>
-        <w:t xml:space="preserve">Holding a tool directly rather than requesting through the permission layer.</w:t>
+        <w:t xml:space="preserve">A quote reaching a client without an explicit yes.</w:t>
       </w:r>
     </w:p>
     <w:p>
@@ -9755,7 +9755,25 @@
           <w:sz w:val="21"/>
           <w:szCs w:val="21"/>
         </w:rPr>
-        <w:t xml:space="preserve">DECIDE — what this does that builder does not. If the answer is nothing, do not create it.</w:t>
+        <w:t xml:space="preserve">CODE — the outward gate applies as it does to mail.</w:t>
+      </w:r>
+    </w:p>
+    <w:p>
+      <w:pPr>
+        <w:pStyle w:val="ListParagraph"/>
+        <w:numPr>
+          <w:ilvl w:val="0"/>
+          <w:numId w:val="3"/>
+        </w:numPr>
+        <w:spacing w:after="70"/>
+      </w:pPr>
+      <w:r>
+        <w:rPr>
+          <w:color w:val="1A1D21"/>
+          <w:sz w:val="21"/>
+          <w:szCs w:val="21"/>
+        </w:rPr>
+        <w:t xml:space="preserve">DECIDE — the roadmap treats billing and email as separate specialists, while the build rules say personal_assistant IS the mail worker and no new agent is spawned for it. Settle which architecture stands before either is built.</w:t>
       </w:r>
     </w:p>
     <w:p>
@@ -9783,7 +9801,7 @@
           <w:sz w:val="26"/>
           <w:szCs w:val="26"/>
         </w:rPr>
-        <w:t xml:space="preserve">billing_agent</w:t>
+        <w:t xml:space="preserve">llama_slot_a</w:t>
       </w:r>
       <w:r>
         <w:rPr>
@@ -9792,7 +9810,7 @@
           <w:sz w:val="18"/>
           <w:szCs w:val="18"/>
         </w:rPr>
-        <w:t xml:space="preserve">   to be chosen  |  named in the final roadmap</w:t>
+        <w:t xml:space="preserve">   llama, variant undecided  |  Sam’s own experiments</w:t>
       </w:r>
     </w:p>
     <w:p>
@@ -9807,7 +9825,7 @@
           <w:sz w:val="21"/>
           <w:szCs w:val="21"/>
         </w:rPr>
-        <w:t xml:space="preserve">Appears once, in a worked example of the event flow. Not a specification.</w:t>
+        <w:t xml:space="preserve">A free slot for Sam to prompt independently. No assigned job.</w:t>
       </w:r>
     </w:p>
     <w:p>
@@ -9836,7 +9854,7 @@
           <w:sz w:val="21"/>
           <w:szCs w:val="21"/>
         </w:rPr>
-        <w:t xml:space="preserve">Not yet defined. It also collides with an existing rule.</w:t>
+        <w:t xml:space="preserve">A sandbox. Its rubric is containment, because an undefined slot needs guardrails more than a defined one, not fewer.</w:t>
       </w:r>
     </w:p>
     <w:p>
@@ -9870,43 +9888,61 @@
           <w:sz w:val="21"/>
           <w:szCs w:val="21"/>
         </w:rPr>
-        <w:t xml:space="preserve">Inherits the universal contract in full.</w:t>
-      </w:r>
-    </w:p>
-    <w:p>
-      <w:pPr>
-        <w:pStyle w:val="ListParagraph"/>
-        <w:numPr>
-          <w:ilvl w:val="0"/>
-          <w:numId w:val="3"/>
-        </w:numPr>
-        <w:spacing w:after="70"/>
-      </w:pPr>
-      <w:r>
-        <w:rPr>
-          <w:color w:val="1A1D21"/>
-          <w:sz w:val="21"/>
-          <w:szCs w:val="21"/>
-        </w:rPr>
-        <w:t xml:space="preserve">Anything producing a quote or an invoice is an outward action and stops for Sam.</w:t>
-      </w:r>
-    </w:p>
-    <w:p>
-      <w:pPr>
-        <w:pStyle w:val="ListParagraph"/>
-        <w:numPr>
-          <w:ilvl w:val="0"/>
-          <w:numId w:val="3"/>
-        </w:numPr>
-        <w:spacing w:after="70"/>
-      </w:pPr>
-      <w:r>
-        <w:rPr>
-          <w:color w:val="1A1D21"/>
-          <w:sz w:val="21"/>
-          <w:szCs w:val="21"/>
-        </w:rPr>
-        <w:t xml:space="preserve">Figures are stated only from what was supplied — never estimated to look complete.</w:t>
+        <w:t xml:space="preserve">Not in the routing menu until it has a written job.</w:t>
+      </w:r>
+    </w:p>
+    <w:p>
+      <w:pPr>
+        <w:pStyle w:val="ListParagraph"/>
+        <w:numPr>
+          <w:ilvl w:val="0"/>
+          <w:numId w:val="3"/>
+        </w:numPr>
+        <w:spacing w:after="70"/>
+      </w:pPr>
+      <w:r>
+        <w:rPr>
+          <w:color w:val="1A1D21"/>
+          <w:sz w:val="21"/>
+          <w:szCs w:val="21"/>
+        </w:rPr>
+        <w:t xml:space="preserve">No tools. It can talk and nothing else.</w:t>
+      </w:r>
+    </w:p>
+    <w:p>
+      <w:pPr>
+        <w:pStyle w:val="ListParagraph"/>
+        <w:numPr>
+          <w:ilvl w:val="0"/>
+          <w:numId w:val="3"/>
+        </w:numPr>
+        <w:spacing w:after="70"/>
+      </w:pPr>
+      <w:r>
+        <w:rPr>
+          <w:color w:val="1A1D21"/>
+          <w:sz w:val="21"/>
+          <w:szCs w:val="21"/>
+        </w:rPr>
+        <w:t xml:space="preserve">Writes nothing into the shared pool.</w:t>
+      </w:r>
+    </w:p>
+    <w:p>
+      <w:pPr>
+        <w:pStyle w:val="ListParagraph"/>
+        <w:numPr>
+          <w:ilvl w:val="0"/>
+          <w:numId w:val="3"/>
+        </w:numPr>
+        <w:spacing w:after="70"/>
+      </w:pPr>
+      <w:r>
+        <w:rPr>
+          <w:color w:val="1A1D21"/>
+          <w:sz w:val="21"/>
+          <w:szCs w:val="21"/>
+        </w:rPr>
+        <w:t xml:space="preserve">Its output is never treated as a system result.</w:t>
       </w:r>
     </w:p>
     <w:p>
@@ -9935,7 +9971,7 @@
           <w:sz w:val="21"/>
           <w:szCs w:val="21"/>
         </w:rPr>
-        <w:t xml:space="preserve">ground() against the request. The permission layer for anything outward.</w:t>
+        <w:t xml:space="preserve">Config — absent from the router roster, no tools listed, own memory line.</w:t>
       </w:r>
     </w:p>
     <w:p>
@@ -9969,7 +10005,7 @@
           <w:sz w:val="21"/>
           <w:szCs w:val="21"/>
         </w:rPr>
-        <w:t xml:space="preserve">An invented amount, rate or reference.</w:t>
+        <w:t xml:space="preserve">Appearing in the routing menu without a written job.</w:t>
       </w:r>
     </w:p>
     <w:p>
@@ -9987,7 +10023,25 @@
           <w:sz w:val="21"/>
           <w:szCs w:val="21"/>
         </w:rPr>
-        <w:t xml:space="preserve">A quote reaching a client without an explicit yes.</w:t>
+        <w:t xml:space="preserve">Being given a tool.</w:t>
+      </w:r>
+    </w:p>
+    <w:p>
+      <w:pPr>
+        <w:pStyle w:val="ListParagraph"/>
+        <w:numPr>
+          <w:ilvl w:val="0"/>
+          <w:numId w:val="4"/>
+        </w:numPr>
+        <w:spacing w:after="70"/>
+      </w:pPr>
+      <w:r>
+        <w:rPr>
+          <w:color w:val="9D3A2E"/>
+          <w:sz w:val="21"/>
+          <w:szCs w:val="21"/>
+        </w:rPr>
+        <w:t xml:space="preserve">Anything it produces being passed on as a finding.</w:t>
       </w:r>
     </w:p>
     <w:p>
@@ -10016,7 +10070,7 @@
           <w:sz w:val="21"/>
           <w:szCs w:val="21"/>
         </w:rPr>
-        <w:t xml:space="preserve">Standard contract.</w:t>
+        <w:t xml:space="preserve">Conversation only.</w:t>
       </w:r>
     </w:p>
     <w:p>
@@ -10050,25 +10104,61 @@
           <w:sz w:val="21"/>
           <w:szCs w:val="21"/>
         </w:rPr>
-        <w:t xml:space="preserve">CODE — the outward gate applies as it does to mail.</w:t>
-      </w:r>
-    </w:p>
-    <w:p>
-      <w:pPr>
-        <w:pStyle w:val="ListParagraph"/>
-        <w:numPr>
-          <w:ilvl w:val="0"/>
-          <w:numId w:val="3"/>
-        </w:numPr>
-        <w:spacing w:after="70"/>
-      </w:pPr>
-      <w:r>
-        <w:rPr>
-          <w:color w:val="1A1D21"/>
-          <w:sz w:val="21"/>
-          <w:szCs w:val="21"/>
-        </w:rPr>
-        <w:t xml:space="preserve">DECIDE — the roadmap treats billing and email as separate specialists, while the build rules say personal_assistant IS the mail worker and no new agent is spawned for it. Settle which architecture stands before either is built.</w:t>
+        <w:t xml:space="preserve">CODE — excluded from the router roster.</w:t>
+      </w:r>
+    </w:p>
+    <w:p>
+      <w:pPr>
+        <w:pStyle w:val="ListParagraph"/>
+        <w:numPr>
+          <w:ilvl w:val="0"/>
+          <w:numId w:val="3"/>
+        </w:numPr>
+        <w:spacing w:after="70"/>
+      </w:pPr>
+      <w:r>
+        <w:rPr>
+          <w:color w:val="1A1D21"/>
+          <w:sz w:val="21"/>
+          <w:szCs w:val="21"/>
+        </w:rPr>
+        <w:t xml:space="preserve">CODE — empty tool list.</w:t>
+      </w:r>
+    </w:p>
+    <w:p>
+      <w:pPr>
+        <w:pStyle w:val="ListParagraph"/>
+        <w:numPr>
+          <w:ilvl w:val="0"/>
+          <w:numId w:val="3"/>
+        </w:numPr>
+        <w:spacing w:after="70"/>
+      </w:pPr>
+      <w:r>
+        <w:rPr>
+          <w:color w:val="1A1D21"/>
+          <w:sz w:val="21"/>
+          <w:szCs w:val="21"/>
+        </w:rPr>
+        <w:t xml:space="preserve">CODE — its own memory line, so nothing it says reaches the working pool.</w:t>
+      </w:r>
+    </w:p>
+    <w:p>
+      <w:pPr>
+        <w:pStyle w:val="ListParagraph"/>
+        <w:numPr>
+          <w:ilvl w:val="0"/>
+          <w:numId w:val="3"/>
+        </w:numPr>
+        <w:spacing w:after="70"/>
+      </w:pPr>
+      <w:r>
+        <w:rPr>
+          <w:color w:val="1A1D21"/>
+          <w:sz w:val="21"/>
+          <w:szCs w:val="21"/>
+        </w:rPr>
+        <w:t xml:space="preserve">DECIDE — which Llama variant, and self-hosted or hosted.</w:t>
       </w:r>
     </w:p>
     <w:p>
@@ -10096,7 +10186,7 @@
           <w:sz w:val="26"/>
           <w:szCs w:val="26"/>
         </w:rPr>
-        <w:t xml:space="preserve">llama_slot_a</w:t>
+        <w:t xml:space="preserve">llama_slot_b</w:t>
       </w:r>
       <w:r>
         <w:rPr>
@@ -10120,7 +10210,7 @@
           <w:sz w:val="21"/>
           <w:szCs w:val="21"/>
         </w:rPr>
-        <w:t xml:space="preserve">A free slot for Sam to prompt independently. No assigned job.</w:t>
+        <w:t xml:space="preserve">The second free slot. The documents never distinguish it from the first.</w:t>
       </w:r>
     </w:p>
     <w:p>
@@ -10149,7 +10239,7 @@
           <w:sz w:val="21"/>
           <w:szCs w:val="21"/>
         </w:rPr>
-        <w:t xml:space="preserve">A sandbox. Its rubric is containment, because an undefined slot needs guardrails more than a defined one, not fewer.</w:t>
+        <w:t xml:space="preserve">As slot A. Containment until a job exists.</w:t>
       </w:r>
     </w:p>
     <w:p>
@@ -10183,61 +10273,7 @@
           <w:sz w:val="21"/>
           <w:szCs w:val="21"/>
         </w:rPr>
-        <w:t xml:space="preserve">Not in the routing menu until it has a written job.</w:t>
-      </w:r>
-    </w:p>
-    <w:p>
-      <w:pPr>
-        <w:pStyle w:val="ListParagraph"/>
-        <w:numPr>
-          <w:ilvl w:val="0"/>
-          <w:numId w:val="3"/>
-        </w:numPr>
-        <w:spacing w:after="70"/>
-      </w:pPr>
-      <w:r>
-        <w:rPr>
-          <w:color w:val="1A1D21"/>
-          <w:sz w:val="21"/>
-          <w:szCs w:val="21"/>
-        </w:rPr>
-        <w:t xml:space="preserve">No tools. It can talk and nothing else.</w:t>
-      </w:r>
-    </w:p>
-    <w:p>
-      <w:pPr>
-        <w:pStyle w:val="ListParagraph"/>
-        <w:numPr>
-          <w:ilvl w:val="0"/>
-          <w:numId w:val="3"/>
-        </w:numPr>
-        <w:spacing w:after="70"/>
-      </w:pPr>
-      <w:r>
-        <w:rPr>
-          <w:color w:val="1A1D21"/>
-          <w:sz w:val="21"/>
-          <w:szCs w:val="21"/>
-        </w:rPr>
-        <w:t xml:space="preserve">Writes nothing into the shared pool.</w:t>
-      </w:r>
-    </w:p>
-    <w:p>
-      <w:pPr>
-        <w:pStyle w:val="ListParagraph"/>
-        <w:numPr>
-          <w:ilvl w:val="0"/>
-          <w:numId w:val="3"/>
-        </w:numPr>
-        <w:spacing w:after="70"/>
-      </w:pPr>
-      <w:r>
-        <w:rPr>
-          <w:color w:val="1A1D21"/>
-          <w:sz w:val="21"/>
-          <w:szCs w:val="21"/>
-        </w:rPr>
-        <w:t xml:space="preserve">Its output is never treated as a system result.</w:t>
+        <w:t xml:space="preserve">Identical to slot A in every respect until the two are given different jobs.</w:t>
       </w:r>
     </w:p>
     <w:p>
@@ -10266,7 +10302,7 @@
           <w:sz w:val="21"/>
           <w:szCs w:val="21"/>
         </w:rPr>
-        <w:t xml:space="preserve">Config — absent from the router roster, no tools listed, own memory line.</w:t>
+        <w:t xml:space="preserve">As slot A.</w:t>
       </w:r>
     </w:p>
     <w:p>
@@ -10300,43 +10336,7 @@
           <w:sz w:val="21"/>
           <w:szCs w:val="21"/>
         </w:rPr>
-        <w:t xml:space="preserve">Appearing in the routing menu without a written job.</w:t>
-      </w:r>
-    </w:p>
-    <w:p>
-      <w:pPr>
-        <w:pStyle w:val="ListParagraph"/>
-        <w:numPr>
-          <w:ilvl w:val="0"/>
-          <w:numId w:val="4"/>
-        </w:numPr>
-        <w:spacing w:after="70"/>
-      </w:pPr>
-      <w:r>
-        <w:rPr>
-          <w:color w:val="9D3A2E"/>
-          <w:sz w:val="21"/>
-          <w:szCs w:val="21"/>
-        </w:rPr>
-        <w:t xml:space="preserve">Being given a tool.</w:t>
-      </w:r>
-    </w:p>
-    <w:p>
-      <w:pPr>
-        <w:pStyle w:val="ListParagraph"/>
-        <w:numPr>
-          <w:ilvl w:val="0"/>
-          <w:numId w:val="4"/>
-        </w:numPr>
-        <w:spacing w:after="70"/>
-      </w:pPr>
-      <w:r>
-        <w:rPr>
-          <w:color w:val="9D3A2E"/>
-          <w:sz w:val="21"/>
-          <w:szCs w:val="21"/>
-        </w:rPr>
-        <w:t xml:space="preserve">Anything it produces being passed on as a finding.</w:t>
+        <w:t xml:space="preserve">As slot A.</w:t>
       </w:r>
     </w:p>
     <w:p>
@@ -10399,61 +10399,25 @@
           <w:sz w:val="21"/>
           <w:szCs w:val="21"/>
         </w:rPr>
-        <w:t xml:space="preserve">CODE — excluded from the router roster.</w:t>
-      </w:r>
-    </w:p>
-    <w:p>
-      <w:pPr>
-        <w:pStyle w:val="ListParagraph"/>
-        <w:numPr>
-          <w:ilvl w:val="0"/>
-          <w:numId w:val="3"/>
-        </w:numPr>
-        <w:spacing w:after="70"/>
-      </w:pPr>
-      <w:r>
-        <w:rPr>
-          <w:color w:val="1A1D21"/>
-          <w:sz w:val="21"/>
-          <w:szCs w:val="21"/>
-        </w:rPr>
-        <w:t xml:space="preserve">CODE — empty tool list.</w:t>
-      </w:r>
-    </w:p>
-    <w:p>
-      <w:pPr>
-        <w:pStyle w:val="ListParagraph"/>
-        <w:numPr>
-          <w:ilvl w:val="0"/>
-          <w:numId w:val="3"/>
-        </w:numPr>
-        <w:spacing w:after="70"/>
-      </w:pPr>
-      <w:r>
-        <w:rPr>
-          <w:color w:val="1A1D21"/>
-          <w:sz w:val="21"/>
-          <w:szCs w:val="21"/>
-        </w:rPr>
-        <w:t xml:space="preserve">CODE — its own memory line, so nothing it says reaches the working pool.</w:t>
-      </w:r>
-    </w:p>
-    <w:p>
-      <w:pPr>
-        <w:pStyle w:val="ListParagraph"/>
-        <w:numPr>
-          <w:ilvl w:val="0"/>
-          <w:numId w:val="3"/>
-        </w:numPr>
-        <w:spacing w:after="70"/>
-      </w:pPr>
-      <w:r>
-        <w:rPr>
-          <w:color w:val="1A1D21"/>
-          <w:sz w:val="21"/>
-          <w:szCs w:val="21"/>
-        </w:rPr>
-        <w:t xml:space="preserve">DECIDE — which Llama variant, and self-hosted or hosted.</w:t>
+        <w:t xml:space="preserve">As slot A.</w:t>
+      </w:r>
+    </w:p>
+    <w:p>
+      <w:pPr>
+        <w:pStyle w:val="ListParagraph"/>
+        <w:numPr>
+          <w:ilvl w:val="0"/>
+          <w:numId w:val="3"/>
+        </w:numPr>
+        <w:spacing w:after="70"/>
+      </w:pPr>
+      <w:r>
+        <w:rPr>
+          <w:color w:val="1A1D21"/>
+          <w:sz w:val="21"/>
+          <w:szCs w:val="21"/>
+        </w:rPr>
+        <w:t xml:space="preserve">DECIDE — what makes this different from slot A. If nothing does, run one slot.</w:t>
       </w:r>
     </w:p>
     <w:p>
@@ -10469,6 +10433,25 @@
     </w:p>
     <w:p>
       <w:pPr>
+        <w:pBdr>
+          <w:bottom w:val="single" w:color="1A1D21" w:sz="12"/>
+        </w:pBdr>
+        <w:spacing w:after="60" w:before="420"/>
+      </w:pPr>
+      <w:r>
+        <w:rPr>
+          <w:b/>
+          <w:bCs/>
+          <w:color w:val="8A5A0B"/>
+          <w:spacing w:val="30"/>
+          <w:sz w:val="19"/>
+          <w:szCs w:val="19"/>
+        </w:rPr>
+        <w:t xml:space="preserve">E — DECIDED AGAINST</w:t>
+      </w:r>
+    </w:p>
+    <w:p>
+      <w:pPr>
         <w:pStyle w:val="Heading2"/>
         <w:spacing w:after="40" w:before="320"/>
       </w:pPr>
@@ -10481,7 +10464,7 @@
           <w:sz w:val="26"/>
           <w:szCs w:val="26"/>
         </w:rPr>
-        <w:t xml:space="preserve">llama_slot_b</w:t>
+        <w:t xml:space="preserve">coding_worker</w:t>
       </w:r>
       <w:r>
         <w:rPr>
@@ -10490,7 +10473,7 @@
           <w:sz w:val="18"/>
           <w:szCs w:val="18"/>
         </w:rPr>
-        <w:t xml:space="preserve">   llama, variant undecided  |  Sam’s own experiments</w:t>
+        <w:t xml:space="preserve">   not to be built  |  decision closed</w:t>
       </w:r>
     </w:p>
     <w:p>
@@ -10505,7 +10488,7 @@
           <w:sz w:val="21"/>
           <w:szCs w:val="21"/>
         </w:rPr>
-        <w:t xml:space="preserve">The second free slot. The documents never distinguish it from the first.</w:t>
+        <w:t xml:space="preserve">Named in two documents as a Stage 5 clone candidate. Will not be created.</w:t>
       </w:r>
     </w:p>
     <w:p>
@@ -10534,7 +10517,7 @@
           <w:sz w:val="21"/>
           <w:szCs w:val="21"/>
         </w:rPr>
-        <w:t xml:space="preserve">As slot A. Containment until a job exists.</w:t>
+        <w:t xml:space="preserve">Closed. builder already covers architecture, code, debugging and deployment, and nothing was identified that this would do differently.</w:t>
       </w:r>
     </w:p>
     <w:p>
@@ -10568,7 +10551,25 @@
           <w:sz w:val="21"/>
           <w:szCs w:val="21"/>
         </w:rPr>
-        <w:t xml:space="preserve">Identical to slot A in every respect until the two are given different jobs.</w:t>
+        <w:t xml:space="preserve">Coding work routes to builder.</w:t>
+      </w:r>
+    </w:p>
+    <w:p>
+      <w:pPr>
+        <w:pStyle w:val="ListParagraph"/>
+        <w:numPr>
+          <w:ilvl w:val="0"/>
+          <w:numId w:val="3"/>
+        </w:numPr>
+        <w:spacing w:after="70"/>
+      </w:pPr>
+      <w:r>
+        <w:rPr>
+          <w:color w:val="1A1D21"/>
+          <w:sz w:val="21"/>
+          <w:szCs w:val="21"/>
+        </w:rPr>
+        <w:t xml:space="preserve">This decision is recorded so the proposal is not reopened without new grounds.</w:t>
       </w:r>
     </w:p>
     <w:p>
@@ -10597,7 +10598,7 @@
           <w:sz w:val="21"/>
           <w:szCs w:val="21"/>
         </w:rPr>
-        <w:t xml:space="preserve">As slot A.</w:t>
+        <w:t xml:space="preserve">The router menu. coding_worker is not on the roster and is not to be added.</w:t>
       </w:r>
     </w:p>
     <w:p>
@@ -10631,7 +10632,25 @@
           <w:sz w:val="21"/>
           <w:szCs w:val="21"/>
         </w:rPr>
-        <w:t xml:space="preserve">As slot A.</w:t>
+        <w:t xml:space="preserve">Creating this slot without a written scope that distinguishes it from builder.</w:t>
+      </w:r>
+    </w:p>
+    <w:p>
+      <w:pPr>
+        <w:pStyle w:val="ListParagraph"/>
+        <w:numPr>
+          <w:ilvl w:val="0"/>
+          <w:numId w:val="4"/>
+        </w:numPr>
+        <w:spacing w:after="70"/>
+      </w:pPr>
+      <w:r>
+        <w:rPr>
+          <w:color w:val="9D3A2E"/>
+          <w:sz w:val="21"/>
+          <w:szCs w:val="21"/>
+        </w:rPr>
+        <w:t xml:space="preserve">Reopening the proposal without new evidence.</w:t>
       </w:r>
     </w:p>
     <w:p>
@@ -10660,7 +10679,7 @@
           <w:sz w:val="21"/>
           <w:szCs w:val="21"/>
         </w:rPr>
-        <w:t xml:space="preserve">Conversation only.</w:t>
+        <w:t xml:space="preserve">Not applicable.</w:t>
       </w:r>
     </w:p>
     <w:p>
@@ -10694,25 +10713,25 @@
           <w:sz w:val="21"/>
           <w:szCs w:val="21"/>
         </w:rPr>
-        <w:t xml:space="preserve">As slot A.</w:t>
-      </w:r>
-    </w:p>
-    <w:p>
-      <w:pPr>
-        <w:pStyle w:val="ListParagraph"/>
-        <w:numPr>
-          <w:ilvl w:val="0"/>
-          <w:numId w:val="3"/>
-        </w:numPr>
-        <w:spacing w:after="70"/>
-      </w:pPr>
-      <w:r>
-        <w:rPr>
-          <w:color w:val="1A1D21"/>
-          <w:sz w:val="21"/>
-          <w:szCs w:val="21"/>
-        </w:rPr>
-        <w:t xml:space="preserve">DECIDE — what makes this different from slot A. If nothing does, run one slot.</w:t>
+        <w:t xml:space="preserve">DECIDED — Sam, this session. Not to be built.</w:t>
+      </w:r>
+    </w:p>
+    <w:p>
+      <w:pPr>
+        <w:pStyle w:val="ListParagraph"/>
+        <w:numPr>
+          <w:ilvl w:val="0"/>
+          <w:numId w:val="3"/>
+        </w:numPr>
+        <w:spacing w:after="70"/>
+      </w:pPr>
+      <w:r>
+        <w:rPr>
+          <w:color w:val="1A1D21"/>
+          <w:sz w:val="21"/>
+          <w:szCs w:val="21"/>
+        </w:rPr>
+        <w:t xml:space="preserve">CODE — absent from slots_config.json and from the router roster.</w:t>
       </w:r>
     </w:p>
     <w:p>

</xml_diff>

<commit_message>
Remove calendar_worker and both Llama slots
Deleted. Eighteen agents remain.

Kept per Sam: billing_agent, the forge and mind pair, and
personal_assistant.

Co-Authored-By: Claude Opus 5 <noreply@anthropic.com>
Claude-Session: https://claude.ai/code/session_01CV3yfiTKLESTajPt6khfV9
</commit_message>
<xml_diff>
--- a/Command_Desk_Rubrics_and_Guardrails.docx
+++ b/Command_Desk_Rubrics_and_Guardrails.docx
@@ -306,7 +306,7 @@
                 <w:sz w:val="20"/>
                 <w:szCs w:val="20"/>
               </w:rPr>
-              <w:t xml:space="preserve">Twenty-one agents in four groups. Each with purpose, measurable requirements, verification method, auto-fail conditions, output contract, and the guards holding it.</w:t>
+              <w:t xml:space="preserve">Eighteen agents in four groups. Each with purpose, measurable requirements, verification method, auto-fail conditions, output contract, and the guards holding it.</w:t>
             </w:r>
           </w:p>
         </w:tc>
@@ -322,7 +322,7 @@
           <w:sz w:val="19"/>
           <w:szCs w:val="19"/>
         </w:rPr>
-        <w:t xml:space="preserve">Eleven are live. Two sit on the box with prompts written and are not in the config. Four are designed and specified. Four are named in the documents with no scope yet — their rubrics are containment rules, because an undefined slot needs guardrails more than a defined one, not fewer.</w:t>
+        <w:t xml:space="preserve">Eleven are live. Two sit on the box with prompts written and are not in the config. Four are designed and specified. One is named in the documents with no scope yet — its rubric is containment, because an undefined slot needs guardrails more than a defined one, not fewer.</w:t>
       </w:r>
     </w:p>
     <w:p>
@@ -9139,7 +9139,7 @@
           <w:sz w:val="26"/>
           <w:szCs w:val="26"/>
         </w:rPr>
-        <w:t xml:space="preserve">calendar_worker</w:t>
+        <w:t xml:space="preserve">billing_agent</w:t>
       </w:r>
       <w:r>
         <w:rPr>
@@ -9148,7 +9148,7 @@
           <w:sz w:val="18"/>
           <w:szCs w:val="18"/>
         </w:rPr>
-        <w:t xml:space="preserve">   to be chosen  |  named in backend spec §6</w:t>
+        <w:t xml:space="preserve">   to be chosen  |  named in the final roadmap</w:t>
       </w:r>
     </w:p>
     <w:p>
@@ -9163,7 +9163,7 @@
           <w:sz w:val="21"/>
           <w:szCs w:val="21"/>
         </w:rPr>
-        <w:t xml:space="preserve">Would run Command Desk’s own calendar view, two-way synced with the external calendar.</w:t>
+        <w:t xml:space="preserve">Appears once, in a worked example of the event flow. Not a specification.</w:t>
       </w:r>
     </w:p>
     <w:p>
@@ -9192,7 +9192,7 @@
           <w:sz w:val="21"/>
           <w:szCs w:val="21"/>
         </w:rPr>
-        <w:t xml:space="preserve">Not yet defined. The spec establishes the shape; the rules below are what must hold whatever it becomes.</w:t>
+        <w:t xml:space="preserve">Not yet defined. It also collides with an existing rule.</w:t>
       </w:r>
     </w:p>
     <w:p>
@@ -9226,61 +9226,43 @@
           <w:sz w:val="21"/>
           <w:szCs w:val="21"/>
         </w:rPr>
-        <w:t xml:space="preserve">Reads only, until the write path is separately approved.</w:t>
-      </w:r>
-    </w:p>
-    <w:p>
-      <w:pPr>
-        <w:pStyle w:val="ListParagraph"/>
-        <w:numPr>
-          <w:ilvl w:val="0"/>
-          <w:numId w:val="3"/>
-        </w:numPr>
-        <w:spacing w:after="70"/>
-      </w:pPr>
-      <w:r>
-        <w:rPr>
-          <w:color w:val="1A1D21"/>
-          <w:sz w:val="21"/>
-          <w:szCs w:val="21"/>
-        </w:rPr>
-        <w:t xml:space="preserve">Every event described matches one the fetch actually returned.</w:t>
-      </w:r>
-    </w:p>
-    <w:p>
-      <w:pPr>
-        <w:pStyle w:val="ListParagraph"/>
-        <w:numPr>
-          <w:ilvl w:val="0"/>
-          <w:numId w:val="3"/>
-        </w:numPr>
-        <w:spacing w:after="70"/>
-      </w:pPr>
-      <w:r>
-        <w:rPr>
-          <w:color w:val="1A1D21"/>
-          <w:sz w:val="21"/>
-          <w:szCs w:val="21"/>
-        </w:rPr>
-        <w:t xml:space="preserve">Creating or moving an event is an outward action and goes through the permission layer behind confirmation.</w:t>
-      </w:r>
-    </w:p>
-    <w:p>
-      <w:pPr>
-        <w:pStyle w:val="ListParagraph"/>
-        <w:numPr>
-          <w:ilvl w:val="0"/>
-          <w:numId w:val="3"/>
-        </w:numPr>
-        <w:spacing w:after="70"/>
-      </w:pPr>
-      <w:r>
-        <w:rPr>
-          <w:color w:val="1A1D21"/>
-          <w:sz w:val="21"/>
-          <w:szCs w:val="21"/>
-        </w:rPr>
-        <w:t xml:space="preserve">A lost network reply never becomes a second calendar entry.</w:t>
+        <w:t xml:space="preserve">Inherits the universal contract in full.</w:t>
+      </w:r>
+    </w:p>
+    <w:p>
+      <w:pPr>
+        <w:pStyle w:val="ListParagraph"/>
+        <w:numPr>
+          <w:ilvl w:val="0"/>
+          <w:numId w:val="3"/>
+        </w:numPr>
+        <w:spacing w:after="70"/>
+      </w:pPr>
+      <w:r>
+        <w:rPr>
+          <w:color w:val="1A1D21"/>
+          <w:sz w:val="21"/>
+          <w:szCs w:val="21"/>
+        </w:rPr>
+        <w:t xml:space="preserve">Anything producing a quote or an invoice is an outward action and stops for Sam.</w:t>
+      </w:r>
+    </w:p>
+    <w:p>
+      <w:pPr>
+        <w:pStyle w:val="ListParagraph"/>
+        <w:numPr>
+          <w:ilvl w:val="0"/>
+          <w:numId w:val="3"/>
+        </w:numPr>
+        <w:spacing w:after="70"/>
+      </w:pPr>
+      <w:r>
+        <w:rPr>
+          <w:color w:val="1A1D21"/>
+          <w:sz w:val="21"/>
+          <w:szCs w:val="21"/>
+        </w:rPr>
+        <w:t xml:space="preserve">Figures are stated only from what was supplied — never estimated to look complete.</w:t>
       </w:r>
     </w:p>
     <w:p>
@@ -9309,7 +9291,7 @@
           <w:sz w:val="21"/>
           <w:szCs w:val="21"/>
         </w:rPr>
-        <w:t xml:space="preserve">Tool output for fidelity. The permission layer for anything that writes.</w:t>
+        <w:t xml:space="preserve">ground() against the request. The permission layer for anything outward.</w:t>
       </w:r>
     </w:p>
     <w:p>
@@ -9343,7 +9325,7 @@
           <w:sz w:val="21"/>
           <w:szCs w:val="21"/>
         </w:rPr>
-        <w:t xml:space="preserve">Describing an event that was not fetched.</w:t>
+        <w:t xml:space="preserve">An invented amount, rate or reference.</w:t>
       </w:r>
     </w:p>
     <w:p>
@@ -9361,25 +9343,7 @@
           <w:sz w:val="21"/>
           <w:szCs w:val="21"/>
         </w:rPr>
-        <w:t xml:space="preserve">Writing to the calendar without a confirmed yes.</w:t>
-      </w:r>
-    </w:p>
-    <w:p>
-      <w:pPr>
-        <w:pStyle w:val="ListParagraph"/>
-        <w:numPr>
-          <w:ilvl w:val="0"/>
-          <w:numId w:val="4"/>
-        </w:numPr>
-        <w:spacing w:after="70"/>
-      </w:pPr>
-      <w:r>
-        <w:rPr>
-          <w:color w:val="9D3A2E"/>
-          <w:sz w:val="21"/>
-          <w:szCs w:val="21"/>
-        </w:rPr>
-        <w:t xml:space="preserve">Retrying an unconfirmed write.</w:t>
+        <w:t xml:space="preserve">A quote reaching a client without an explicit yes.</w:t>
       </w:r>
     </w:p>
     <w:p>
@@ -9442,319 +9406,6 @@
           <w:sz w:val="21"/>
           <w:szCs w:val="21"/>
         </w:rPr>
-        <w:t xml:space="preserve">CODE — the tool would live in the permission layer, exactly as Gmail does.</w:t>
-      </w:r>
-    </w:p>
-    <w:p>
-      <w:pPr>
-        <w:pStyle w:val="ListParagraph"/>
-        <w:numPr>
-          <w:ilvl w:val="0"/>
-          <w:numId w:val="3"/>
-        </w:numPr>
-        <w:spacing w:after="70"/>
-      </w:pPr>
-      <w:r>
-        <w:rPr>
-          <w:color w:val="1A1D21"/>
-          <w:sz w:val="21"/>
-          <w:szCs w:val="21"/>
-        </w:rPr>
-        <w:t xml:space="preserve">DECIDE — conflict rules first: which side wins a simultaneous edit, how a deletion is told from a failed fetch, what a recurring-event edit means, and how far back a sync reaches.</w:t>
-      </w:r>
-    </w:p>
-    <w:p>
-      <w:pPr>
-        <w:pBdr>
-          <w:bottom w:val="single" w:color="C8CDD4" w:sz="6"/>
-        </w:pBdr>
-        <w:spacing w:after="200" w:before="120"/>
-      </w:pPr>
-      <w:r>
-        <w:t xml:space="preserve"/>
-      </w:r>
-    </w:p>
-    <w:p>
-      <w:pPr>
-        <w:pStyle w:val="Heading2"/>
-        <w:spacing w:after="40" w:before="320"/>
-      </w:pPr>
-      <w:r>
-        <w:rPr>
-          <w:rFonts w:ascii="Consolas" w:cs="Consolas" w:eastAsia="Consolas" w:hAnsi="Consolas"/>
-          <w:b/>
-          <w:bCs/>
-          <w:color w:val="1A1D21"/>
-          <w:sz w:val="26"/>
-          <w:szCs w:val="26"/>
-        </w:rPr>
-        <w:t xml:space="preserve">billing_agent</w:t>
-      </w:r>
-      <w:r>
-        <w:rPr>
-          <w:rFonts w:ascii="Consolas" w:cs="Consolas" w:eastAsia="Consolas" w:hAnsi="Consolas"/>
-          <w:color w:val="5C6670"/>
-          <w:sz w:val="18"/>
-          <w:szCs w:val="18"/>
-        </w:rPr>
-        <w:t xml:space="preserve">   to be chosen  |  named in the final roadmap</w:t>
-      </w:r>
-    </w:p>
-    <w:p>
-      <w:pPr>
-        <w:spacing w:after="140" w:before="0"/>
-      </w:pPr>
-      <w:r>
-        <w:rPr>
-          <w:i/>
-          <w:iCs/>
-          <w:color w:val="5C6670"/>
-          <w:sz w:val="21"/>
-          <w:szCs w:val="21"/>
-        </w:rPr>
-        <w:t xml:space="preserve">Appears once, in a worked example of the event flow. Not a specification.</w:t>
-      </w:r>
-    </w:p>
-    <w:p>
-      <w:pPr>
-        <w:spacing w:after="60" w:before="160"/>
-      </w:pPr>
-      <w:r>
-        <w:rPr>
-          <w:b/>
-          <w:bCs/>
-          <w:color w:val="5C6670"/>
-          <w:spacing w:val="20"/>
-          <w:sz w:val="17"/>
-          <w:szCs w:val="17"/>
-        </w:rPr>
-        <w:t xml:space="preserve">PURPOSE</w:t>
-      </w:r>
-    </w:p>
-    <w:p>
-      <w:pPr>
-        <w:spacing w:after="120" w:before="0"/>
-      </w:pPr>
-      <w:r>
-        <w:rPr>
-          <w:color w:val="1A1D21"/>
-          <w:sz w:val="21"/>
-          <w:szCs w:val="21"/>
-        </w:rPr>
-        <w:t xml:space="preserve">Not yet defined. It also collides with an existing rule.</w:t>
-      </w:r>
-    </w:p>
-    <w:p>
-      <w:pPr>
-        <w:spacing w:after="60" w:before="160"/>
-      </w:pPr>
-      <w:r>
-        <w:rPr>
-          <w:b/>
-          <w:bCs/>
-          <w:color w:val="5C6670"/>
-          <w:spacing w:val="20"/>
-          <w:sz w:val="17"/>
-          <w:szCs w:val="17"/>
-        </w:rPr>
-        <w:t xml:space="preserve">REQUIREMENTS</w:t>
-      </w:r>
-    </w:p>
-    <w:p>
-      <w:pPr>
-        <w:pStyle w:val="ListParagraph"/>
-        <w:numPr>
-          <w:ilvl w:val="0"/>
-          <w:numId w:val="3"/>
-        </w:numPr>
-        <w:spacing w:after="70"/>
-      </w:pPr>
-      <w:r>
-        <w:rPr>
-          <w:color w:val="1A1D21"/>
-          <w:sz w:val="21"/>
-          <w:szCs w:val="21"/>
-        </w:rPr>
-        <w:t xml:space="preserve">Inherits the universal contract in full.</w:t>
-      </w:r>
-    </w:p>
-    <w:p>
-      <w:pPr>
-        <w:pStyle w:val="ListParagraph"/>
-        <w:numPr>
-          <w:ilvl w:val="0"/>
-          <w:numId w:val="3"/>
-        </w:numPr>
-        <w:spacing w:after="70"/>
-      </w:pPr>
-      <w:r>
-        <w:rPr>
-          <w:color w:val="1A1D21"/>
-          <w:sz w:val="21"/>
-          <w:szCs w:val="21"/>
-        </w:rPr>
-        <w:t xml:space="preserve">Anything producing a quote or an invoice is an outward action and stops for Sam.</w:t>
-      </w:r>
-    </w:p>
-    <w:p>
-      <w:pPr>
-        <w:pStyle w:val="ListParagraph"/>
-        <w:numPr>
-          <w:ilvl w:val="0"/>
-          <w:numId w:val="3"/>
-        </w:numPr>
-        <w:spacing w:after="70"/>
-      </w:pPr>
-      <w:r>
-        <w:rPr>
-          <w:color w:val="1A1D21"/>
-          <w:sz w:val="21"/>
-          <w:szCs w:val="21"/>
-        </w:rPr>
-        <w:t xml:space="preserve">Figures are stated only from what was supplied — never estimated to look complete.</w:t>
-      </w:r>
-    </w:p>
-    <w:p>
-      <w:pPr>
-        <w:spacing w:after="60" w:before="160"/>
-      </w:pPr>
-      <w:r>
-        <w:rPr>
-          <w:b/>
-          <w:bCs/>
-          <w:color w:val="5C6670"/>
-          <w:spacing w:val="20"/>
-          <w:sz w:val="17"/>
-          <w:szCs w:val="17"/>
-        </w:rPr>
-        <w:t xml:space="preserve">VERIFIED BY</w:t>
-      </w:r>
-    </w:p>
-    <w:p>
-      <w:pPr>
-        <w:spacing w:after="120" w:before="0"/>
-      </w:pPr>
-      <w:r>
-        <w:rPr>
-          <w:color w:val="1A1D21"/>
-          <w:sz w:val="21"/>
-          <w:szCs w:val="21"/>
-        </w:rPr>
-        <w:t xml:space="preserve">ground() against the request. The permission layer for anything outward.</w:t>
-      </w:r>
-    </w:p>
-    <w:p>
-      <w:pPr>
-        <w:spacing w:after="60" w:before="160"/>
-      </w:pPr>
-      <w:r>
-        <w:rPr>
-          <w:b/>
-          <w:bCs/>
-          <w:color w:val="5C6670"/>
-          <w:spacing w:val="20"/>
-          <w:sz w:val="17"/>
-          <w:szCs w:val="17"/>
-        </w:rPr>
-        <w:t xml:space="preserve">AUTO-FAIL CONDITIONS</w:t>
-      </w:r>
-    </w:p>
-    <w:p>
-      <w:pPr>
-        <w:pStyle w:val="ListParagraph"/>
-        <w:numPr>
-          <w:ilvl w:val="0"/>
-          <w:numId w:val="4"/>
-        </w:numPr>
-        <w:spacing w:after="70"/>
-      </w:pPr>
-      <w:r>
-        <w:rPr>
-          <w:color w:val="9D3A2E"/>
-          <w:sz w:val="21"/>
-          <w:szCs w:val="21"/>
-        </w:rPr>
-        <w:t xml:space="preserve">An invented amount, rate or reference.</w:t>
-      </w:r>
-    </w:p>
-    <w:p>
-      <w:pPr>
-        <w:pStyle w:val="ListParagraph"/>
-        <w:numPr>
-          <w:ilvl w:val="0"/>
-          <w:numId w:val="4"/>
-        </w:numPr>
-        <w:spacing w:after="70"/>
-      </w:pPr>
-      <w:r>
-        <w:rPr>
-          <w:color w:val="9D3A2E"/>
-          <w:sz w:val="21"/>
-          <w:szCs w:val="21"/>
-        </w:rPr>
-        <w:t xml:space="preserve">A quote reaching a client without an explicit yes.</w:t>
-      </w:r>
-    </w:p>
-    <w:p>
-      <w:pPr>
-        <w:spacing w:after="60" w:before="160"/>
-      </w:pPr>
-      <w:r>
-        <w:rPr>
-          <w:b/>
-          <w:bCs/>
-          <w:color w:val="5C6670"/>
-          <w:spacing w:val="20"/>
-          <w:sz w:val="17"/>
-          <w:szCs w:val="17"/>
-        </w:rPr>
-        <w:t xml:space="preserve">OUTPUT CONTRACT</w:t>
-      </w:r>
-    </w:p>
-    <w:p>
-      <w:pPr>
-        <w:spacing w:after="120" w:before="0"/>
-      </w:pPr>
-      <w:r>
-        <w:rPr>
-          <w:color w:val="1A1D21"/>
-          <w:sz w:val="21"/>
-          <w:szCs w:val="21"/>
-        </w:rPr>
-        <w:t xml:space="preserve">Standard contract.</w:t>
-      </w:r>
-    </w:p>
-    <w:p>
-      <w:pPr>
-        <w:spacing w:after="60" w:before="160"/>
-      </w:pPr>
-      <w:r>
-        <w:rPr>
-          <w:b/>
-          <w:bCs/>
-          <w:color w:val="5C6670"/>
-          <w:spacing w:val="20"/>
-          <w:sz w:val="17"/>
-          <w:szCs w:val="17"/>
-        </w:rPr>
-        <w:t xml:space="preserve">GUARDS HOLDING IT</w:t>
-      </w:r>
-    </w:p>
-    <w:p>
-      <w:pPr>
-        <w:pStyle w:val="ListParagraph"/>
-        <w:numPr>
-          <w:ilvl w:val="0"/>
-          <w:numId w:val="3"/>
-        </w:numPr>
-        <w:spacing w:after="70"/>
-      </w:pPr>
-      <w:r>
-        <w:rPr>
-          <w:color w:val="1A1D21"/>
-          <w:sz w:val="21"/>
-          <w:szCs w:val="21"/>
-        </w:rPr>
         <w:t xml:space="preserve">CODE — the outward gate applies as it does to mail.</w:t>
       </w:r>
     </w:p>
@@ -9774,650 +9425,6 @@
           <w:szCs w:val="21"/>
         </w:rPr>
         <w:t xml:space="preserve">DECIDE — the roadmap treats billing and email as separate specialists, while the build rules say personal_assistant IS the mail worker and no new agent is spawned for it. Settle which architecture stands before either is built.</w:t>
-      </w:r>
-    </w:p>
-    <w:p>
-      <w:pPr>
-        <w:pBdr>
-          <w:bottom w:val="single" w:color="C8CDD4" w:sz="6"/>
-        </w:pBdr>
-        <w:spacing w:after="200" w:before="120"/>
-      </w:pPr>
-      <w:r>
-        <w:t xml:space="preserve"/>
-      </w:r>
-    </w:p>
-    <w:p>
-      <w:pPr>
-        <w:pStyle w:val="Heading2"/>
-        <w:spacing w:after="40" w:before="320"/>
-      </w:pPr>
-      <w:r>
-        <w:rPr>
-          <w:rFonts w:ascii="Consolas" w:cs="Consolas" w:eastAsia="Consolas" w:hAnsi="Consolas"/>
-          <w:b/>
-          <w:bCs/>
-          <w:color w:val="1A1D21"/>
-          <w:sz w:val="26"/>
-          <w:szCs w:val="26"/>
-        </w:rPr>
-        <w:t xml:space="preserve">llama_slot_a</w:t>
-      </w:r>
-      <w:r>
-        <w:rPr>
-          <w:rFonts w:ascii="Consolas" w:cs="Consolas" w:eastAsia="Consolas" w:hAnsi="Consolas"/>
-          <w:color w:val="5C6670"/>
-          <w:sz w:val="18"/>
-          <w:szCs w:val="18"/>
-        </w:rPr>
-        <w:t xml:space="preserve">   llama, variant undecided  |  Sam’s own experiments</w:t>
-      </w:r>
-    </w:p>
-    <w:p>
-      <w:pPr>
-        <w:spacing w:after="140" w:before="0"/>
-      </w:pPr>
-      <w:r>
-        <w:rPr>
-          <w:i/>
-          <w:iCs/>
-          <w:color w:val="5C6670"/>
-          <w:sz w:val="21"/>
-          <w:szCs w:val="21"/>
-        </w:rPr>
-        <w:t xml:space="preserve">A free slot for Sam to prompt independently. No assigned job.</w:t>
-      </w:r>
-    </w:p>
-    <w:p>
-      <w:pPr>
-        <w:spacing w:after="60" w:before="160"/>
-      </w:pPr>
-      <w:r>
-        <w:rPr>
-          <w:b/>
-          <w:bCs/>
-          <w:color w:val="5C6670"/>
-          <w:spacing w:val="20"/>
-          <w:sz w:val="17"/>
-          <w:szCs w:val="17"/>
-        </w:rPr>
-        <w:t xml:space="preserve">PURPOSE</w:t>
-      </w:r>
-    </w:p>
-    <w:p>
-      <w:pPr>
-        <w:spacing w:after="120" w:before="0"/>
-      </w:pPr>
-      <w:r>
-        <w:rPr>
-          <w:color w:val="1A1D21"/>
-          <w:sz w:val="21"/>
-          <w:szCs w:val="21"/>
-        </w:rPr>
-        <w:t xml:space="preserve">A sandbox. Its rubric is containment, because an undefined slot needs guardrails more than a defined one, not fewer.</w:t>
-      </w:r>
-    </w:p>
-    <w:p>
-      <w:pPr>
-        <w:spacing w:after="60" w:before="160"/>
-      </w:pPr>
-      <w:r>
-        <w:rPr>
-          <w:b/>
-          <w:bCs/>
-          <w:color w:val="5C6670"/>
-          <w:spacing w:val="20"/>
-          <w:sz w:val="17"/>
-          <w:szCs w:val="17"/>
-        </w:rPr>
-        <w:t xml:space="preserve">REQUIREMENTS</w:t>
-      </w:r>
-    </w:p>
-    <w:p>
-      <w:pPr>
-        <w:pStyle w:val="ListParagraph"/>
-        <w:numPr>
-          <w:ilvl w:val="0"/>
-          <w:numId w:val="3"/>
-        </w:numPr>
-        <w:spacing w:after="70"/>
-      </w:pPr>
-      <w:r>
-        <w:rPr>
-          <w:color w:val="1A1D21"/>
-          <w:sz w:val="21"/>
-          <w:szCs w:val="21"/>
-        </w:rPr>
-        <w:t xml:space="preserve">Not in the routing menu until it has a written job.</w:t>
-      </w:r>
-    </w:p>
-    <w:p>
-      <w:pPr>
-        <w:pStyle w:val="ListParagraph"/>
-        <w:numPr>
-          <w:ilvl w:val="0"/>
-          <w:numId w:val="3"/>
-        </w:numPr>
-        <w:spacing w:after="70"/>
-      </w:pPr>
-      <w:r>
-        <w:rPr>
-          <w:color w:val="1A1D21"/>
-          <w:sz w:val="21"/>
-          <w:szCs w:val="21"/>
-        </w:rPr>
-        <w:t xml:space="preserve">No tools. It can talk and nothing else.</w:t>
-      </w:r>
-    </w:p>
-    <w:p>
-      <w:pPr>
-        <w:pStyle w:val="ListParagraph"/>
-        <w:numPr>
-          <w:ilvl w:val="0"/>
-          <w:numId w:val="3"/>
-        </w:numPr>
-        <w:spacing w:after="70"/>
-      </w:pPr>
-      <w:r>
-        <w:rPr>
-          <w:color w:val="1A1D21"/>
-          <w:sz w:val="21"/>
-          <w:szCs w:val="21"/>
-        </w:rPr>
-        <w:t xml:space="preserve">Writes nothing into the shared pool.</w:t>
-      </w:r>
-    </w:p>
-    <w:p>
-      <w:pPr>
-        <w:pStyle w:val="ListParagraph"/>
-        <w:numPr>
-          <w:ilvl w:val="0"/>
-          <w:numId w:val="3"/>
-        </w:numPr>
-        <w:spacing w:after="70"/>
-      </w:pPr>
-      <w:r>
-        <w:rPr>
-          <w:color w:val="1A1D21"/>
-          <w:sz w:val="21"/>
-          <w:szCs w:val="21"/>
-        </w:rPr>
-        <w:t xml:space="preserve">Its output is never treated as a system result.</w:t>
-      </w:r>
-    </w:p>
-    <w:p>
-      <w:pPr>
-        <w:spacing w:after="60" w:before="160"/>
-      </w:pPr>
-      <w:r>
-        <w:rPr>
-          <w:b/>
-          <w:bCs/>
-          <w:color w:val="5C6670"/>
-          <w:spacing w:val="20"/>
-          <w:sz w:val="17"/>
-          <w:szCs w:val="17"/>
-        </w:rPr>
-        <w:t xml:space="preserve">VERIFIED BY</w:t>
-      </w:r>
-    </w:p>
-    <w:p>
-      <w:pPr>
-        <w:spacing w:after="120" w:before="0"/>
-      </w:pPr>
-      <w:r>
-        <w:rPr>
-          <w:color w:val="1A1D21"/>
-          <w:sz w:val="21"/>
-          <w:szCs w:val="21"/>
-        </w:rPr>
-        <w:t xml:space="preserve">Config — absent from the router roster, no tools listed, own memory line.</w:t>
-      </w:r>
-    </w:p>
-    <w:p>
-      <w:pPr>
-        <w:spacing w:after="60" w:before="160"/>
-      </w:pPr>
-      <w:r>
-        <w:rPr>
-          <w:b/>
-          <w:bCs/>
-          <w:color w:val="5C6670"/>
-          <w:spacing w:val="20"/>
-          <w:sz w:val="17"/>
-          <w:szCs w:val="17"/>
-        </w:rPr>
-        <w:t xml:space="preserve">AUTO-FAIL CONDITIONS</w:t>
-      </w:r>
-    </w:p>
-    <w:p>
-      <w:pPr>
-        <w:pStyle w:val="ListParagraph"/>
-        <w:numPr>
-          <w:ilvl w:val="0"/>
-          <w:numId w:val="4"/>
-        </w:numPr>
-        <w:spacing w:after="70"/>
-      </w:pPr>
-      <w:r>
-        <w:rPr>
-          <w:color w:val="9D3A2E"/>
-          <w:sz w:val="21"/>
-          <w:szCs w:val="21"/>
-        </w:rPr>
-        <w:t xml:space="preserve">Appearing in the routing menu without a written job.</w:t>
-      </w:r>
-    </w:p>
-    <w:p>
-      <w:pPr>
-        <w:pStyle w:val="ListParagraph"/>
-        <w:numPr>
-          <w:ilvl w:val="0"/>
-          <w:numId w:val="4"/>
-        </w:numPr>
-        <w:spacing w:after="70"/>
-      </w:pPr>
-      <w:r>
-        <w:rPr>
-          <w:color w:val="9D3A2E"/>
-          <w:sz w:val="21"/>
-          <w:szCs w:val="21"/>
-        </w:rPr>
-        <w:t xml:space="preserve">Being given a tool.</w:t>
-      </w:r>
-    </w:p>
-    <w:p>
-      <w:pPr>
-        <w:pStyle w:val="ListParagraph"/>
-        <w:numPr>
-          <w:ilvl w:val="0"/>
-          <w:numId w:val="4"/>
-        </w:numPr>
-        <w:spacing w:after="70"/>
-      </w:pPr>
-      <w:r>
-        <w:rPr>
-          <w:color w:val="9D3A2E"/>
-          <w:sz w:val="21"/>
-          <w:szCs w:val="21"/>
-        </w:rPr>
-        <w:t xml:space="preserve">Anything it produces being passed on as a finding.</w:t>
-      </w:r>
-    </w:p>
-    <w:p>
-      <w:pPr>
-        <w:spacing w:after="60" w:before="160"/>
-      </w:pPr>
-      <w:r>
-        <w:rPr>
-          <w:b/>
-          <w:bCs/>
-          <w:color w:val="5C6670"/>
-          <w:spacing w:val="20"/>
-          <w:sz w:val="17"/>
-          <w:szCs w:val="17"/>
-        </w:rPr>
-        <w:t xml:space="preserve">OUTPUT CONTRACT</w:t>
-      </w:r>
-    </w:p>
-    <w:p>
-      <w:pPr>
-        <w:spacing w:after="120" w:before="0"/>
-      </w:pPr>
-      <w:r>
-        <w:rPr>
-          <w:color w:val="1A1D21"/>
-          <w:sz w:val="21"/>
-          <w:szCs w:val="21"/>
-        </w:rPr>
-        <w:t xml:space="preserve">Conversation only.</w:t>
-      </w:r>
-    </w:p>
-    <w:p>
-      <w:pPr>
-        <w:spacing w:after="60" w:before="160"/>
-      </w:pPr>
-      <w:r>
-        <w:rPr>
-          <w:b/>
-          <w:bCs/>
-          <w:color w:val="5C6670"/>
-          <w:spacing w:val="20"/>
-          <w:sz w:val="17"/>
-          <w:szCs w:val="17"/>
-        </w:rPr>
-        <w:t xml:space="preserve">GUARDS HOLDING IT</w:t>
-      </w:r>
-    </w:p>
-    <w:p>
-      <w:pPr>
-        <w:pStyle w:val="ListParagraph"/>
-        <w:numPr>
-          <w:ilvl w:val="0"/>
-          <w:numId w:val="3"/>
-        </w:numPr>
-        <w:spacing w:after="70"/>
-      </w:pPr>
-      <w:r>
-        <w:rPr>
-          <w:color w:val="1A1D21"/>
-          <w:sz w:val="21"/>
-          <w:szCs w:val="21"/>
-        </w:rPr>
-        <w:t xml:space="preserve">CODE — excluded from the router roster.</w:t>
-      </w:r>
-    </w:p>
-    <w:p>
-      <w:pPr>
-        <w:pStyle w:val="ListParagraph"/>
-        <w:numPr>
-          <w:ilvl w:val="0"/>
-          <w:numId w:val="3"/>
-        </w:numPr>
-        <w:spacing w:after="70"/>
-      </w:pPr>
-      <w:r>
-        <w:rPr>
-          <w:color w:val="1A1D21"/>
-          <w:sz w:val="21"/>
-          <w:szCs w:val="21"/>
-        </w:rPr>
-        <w:t xml:space="preserve">CODE — empty tool list.</w:t>
-      </w:r>
-    </w:p>
-    <w:p>
-      <w:pPr>
-        <w:pStyle w:val="ListParagraph"/>
-        <w:numPr>
-          <w:ilvl w:val="0"/>
-          <w:numId w:val="3"/>
-        </w:numPr>
-        <w:spacing w:after="70"/>
-      </w:pPr>
-      <w:r>
-        <w:rPr>
-          <w:color w:val="1A1D21"/>
-          <w:sz w:val="21"/>
-          <w:szCs w:val="21"/>
-        </w:rPr>
-        <w:t xml:space="preserve">CODE — its own memory line, so nothing it says reaches the working pool.</w:t>
-      </w:r>
-    </w:p>
-    <w:p>
-      <w:pPr>
-        <w:pStyle w:val="ListParagraph"/>
-        <w:numPr>
-          <w:ilvl w:val="0"/>
-          <w:numId w:val="3"/>
-        </w:numPr>
-        <w:spacing w:after="70"/>
-      </w:pPr>
-      <w:r>
-        <w:rPr>
-          <w:color w:val="1A1D21"/>
-          <w:sz w:val="21"/>
-          <w:szCs w:val="21"/>
-        </w:rPr>
-        <w:t xml:space="preserve">DECIDE — which Llama variant, and self-hosted or hosted.</w:t>
-      </w:r>
-    </w:p>
-    <w:p>
-      <w:pPr>
-        <w:pBdr>
-          <w:bottom w:val="single" w:color="C8CDD4" w:sz="6"/>
-        </w:pBdr>
-        <w:spacing w:after="200" w:before="120"/>
-      </w:pPr>
-      <w:r>
-        <w:t xml:space="preserve"/>
-      </w:r>
-    </w:p>
-    <w:p>
-      <w:pPr>
-        <w:pStyle w:val="Heading2"/>
-        <w:spacing w:after="40" w:before="320"/>
-      </w:pPr>
-      <w:r>
-        <w:rPr>
-          <w:rFonts w:ascii="Consolas" w:cs="Consolas" w:eastAsia="Consolas" w:hAnsi="Consolas"/>
-          <w:b/>
-          <w:bCs/>
-          <w:color w:val="1A1D21"/>
-          <w:sz w:val="26"/>
-          <w:szCs w:val="26"/>
-        </w:rPr>
-        <w:t xml:space="preserve">llama_slot_b</w:t>
-      </w:r>
-      <w:r>
-        <w:rPr>
-          <w:rFonts w:ascii="Consolas" w:cs="Consolas" w:eastAsia="Consolas" w:hAnsi="Consolas"/>
-          <w:color w:val="5C6670"/>
-          <w:sz w:val="18"/>
-          <w:szCs w:val="18"/>
-        </w:rPr>
-        <w:t xml:space="preserve">   llama, variant undecided  |  Sam’s own experiments</w:t>
-      </w:r>
-    </w:p>
-    <w:p>
-      <w:pPr>
-        <w:spacing w:after="140" w:before="0"/>
-      </w:pPr>
-      <w:r>
-        <w:rPr>
-          <w:i/>
-          <w:iCs/>
-          <w:color w:val="5C6670"/>
-          <w:sz w:val="21"/>
-          <w:szCs w:val="21"/>
-        </w:rPr>
-        <w:t xml:space="preserve">The second free slot. The documents never distinguish it from the first.</w:t>
-      </w:r>
-    </w:p>
-    <w:p>
-      <w:pPr>
-        <w:spacing w:after="60" w:before="160"/>
-      </w:pPr>
-      <w:r>
-        <w:rPr>
-          <w:b/>
-          <w:bCs/>
-          <w:color w:val="5C6670"/>
-          <w:spacing w:val="20"/>
-          <w:sz w:val="17"/>
-          <w:szCs w:val="17"/>
-        </w:rPr>
-        <w:t xml:space="preserve">PURPOSE</w:t>
-      </w:r>
-    </w:p>
-    <w:p>
-      <w:pPr>
-        <w:spacing w:after="120" w:before="0"/>
-      </w:pPr>
-      <w:r>
-        <w:rPr>
-          <w:color w:val="1A1D21"/>
-          <w:sz w:val="21"/>
-          <w:szCs w:val="21"/>
-        </w:rPr>
-        <w:t xml:space="preserve">As slot A. Containment until a job exists.</w:t>
-      </w:r>
-    </w:p>
-    <w:p>
-      <w:pPr>
-        <w:spacing w:after="60" w:before="160"/>
-      </w:pPr>
-      <w:r>
-        <w:rPr>
-          <w:b/>
-          <w:bCs/>
-          <w:color w:val="5C6670"/>
-          <w:spacing w:val="20"/>
-          <w:sz w:val="17"/>
-          <w:szCs w:val="17"/>
-        </w:rPr>
-        <w:t xml:space="preserve">REQUIREMENTS</w:t>
-      </w:r>
-    </w:p>
-    <w:p>
-      <w:pPr>
-        <w:pStyle w:val="ListParagraph"/>
-        <w:numPr>
-          <w:ilvl w:val="0"/>
-          <w:numId w:val="3"/>
-        </w:numPr>
-        <w:spacing w:after="70"/>
-      </w:pPr>
-      <w:r>
-        <w:rPr>
-          <w:color w:val="1A1D21"/>
-          <w:sz w:val="21"/>
-          <w:szCs w:val="21"/>
-        </w:rPr>
-        <w:t xml:space="preserve">Identical to slot A in every respect until the two are given different jobs.</w:t>
-      </w:r>
-    </w:p>
-    <w:p>
-      <w:pPr>
-        <w:spacing w:after="60" w:before="160"/>
-      </w:pPr>
-      <w:r>
-        <w:rPr>
-          <w:b/>
-          <w:bCs/>
-          <w:color w:val="5C6670"/>
-          <w:spacing w:val="20"/>
-          <w:sz w:val="17"/>
-          <w:szCs w:val="17"/>
-        </w:rPr>
-        <w:t xml:space="preserve">VERIFIED BY</w:t>
-      </w:r>
-    </w:p>
-    <w:p>
-      <w:pPr>
-        <w:spacing w:after="120" w:before="0"/>
-      </w:pPr>
-      <w:r>
-        <w:rPr>
-          <w:color w:val="1A1D21"/>
-          <w:sz w:val="21"/>
-          <w:szCs w:val="21"/>
-        </w:rPr>
-        <w:t xml:space="preserve">As slot A.</w:t>
-      </w:r>
-    </w:p>
-    <w:p>
-      <w:pPr>
-        <w:spacing w:after="60" w:before="160"/>
-      </w:pPr>
-      <w:r>
-        <w:rPr>
-          <w:b/>
-          <w:bCs/>
-          <w:color w:val="5C6670"/>
-          <w:spacing w:val="20"/>
-          <w:sz w:val="17"/>
-          <w:szCs w:val="17"/>
-        </w:rPr>
-        <w:t xml:space="preserve">AUTO-FAIL CONDITIONS</w:t>
-      </w:r>
-    </w:p>
-    <w:p>
-      <w:pPr>
-        <w:pStyle w:val="ListParagraph"/>
-        <w:numPr>
-          <w:ilvl w:val="0"/>
-          <w:numId w:val="4"/>
-        </w:numPr>
-        <w:spacing w:after="70"/>
-      </w:pPr>
-      <w:r>
-        <w:rPr>
-          <w:color w:val="9D3A2E"/>
-          <w:sz w:val="21"/>
-          <w:szCs w:val="21"/>
-        </w:rPr>
-        <w:t xml:space="preserve">As slot A.</w:t>
-      </w:r>
-    </w:p>
-    <w:p>
-      <w:pPr>
-        <w:spacing w:after="60" w:before="160"/>
-      </w:pPr>
-      <w:r>
-        <w:rPr>
-          <w:b/>
-          <w:bCs/>
-          <w:color w:val="5C6670"/>
-          <w:spacing w:val="20"/>
-          <w:sz w:val="17"/>
-          <w:szCs w:val="17"/>
-        </w:rPr>
-        <w:t xml:space="preserve">OUTPUT CONTRACT</w:t>
-      </w:r>
-    </w:p>
-    <w:p>
-      <w:pPr>
-        <w:spacing w:after="120" w:before="0"/>
-      </w:pPr>
-      <w:r>
-        <w:rPr>
-          <w:color w:val="1A1D21"/>
-          <w:sz w:val="21"/>
-          <w:szCs w:val="21"/>
-        </w:rPr>
-        <w:t xml:space="preserve">Conversation only.</w:t>
-      </w:r>
-    </w:p>
-    <w:p>
-      <w:pPr>
-        <w:spacing w:after="60" w:before="160"/>
-      </w:pPr>
-      <w:r>
-        <w:rPr>
-          <w:b/>
-          <w:bCs/>
-          <w:color w:val="5C6670"/>
-          <w:spacing w:val="20"/>
-          <w:sz w:val="17"/>
-          <w:szCs w:val="17"/>
-        </w:rPr>
-        <w:t xml:space="preserve">GUARDS HOLDING IT</w:t>
-      </w:r>
-    </w:p>
-    <w:p>
-      <w:pPr>
-        <w:pStyle w:val="ListParagraph"/>
-        <w:numPr>
-          <w:ilvl w:val="0"/>
-          <w:numId w:val="3"/>
-        </w:numPr>
-        <w:spacing w:after="70"/>
-      </w:pPr>
-      <w:r>
-        <w:rPr>
-          <w:color w:val="1A1D21"/>
-          <w:sz w:val="21"/>
-          <w:szCs w:val="21"/>
-        </w:rPr>
-        <w:t xml:space="preserve">As slot A.</w:t>
-      </w:r>
-    </w:p>
-    <w:p>
-      <w:pPr>
-        <w:pStyle w:val="ListParagraph"/>
-        <w:numPr>
-          <w:ilvl w:val="0"/>
-          <w:numId w:val="3"/>
-        </w:numPr>
-        <w:spacing w:after="70"/>
-      </w:pPr>
-      <w:r>
-        <w:rPr>
-          <w:color w:val="1A1D21"/>
-          <w:sz w:val="21"/>
-          <w:szCs w:val="21"/>
-        </w:rPr>
-        <w:t xml:space="preserve">DECIDE — what makes this different from slot A. If nothing does, run one slot.</w:t>
       </w:r>
     </w:p>
     <w:p>

</xml_diff>